<commit_message>
Refactor pollos capture flow and split remote bootstrap
</commit_message>
<xml_diff>
--- a/EL POLLO.docx
+++ b/EL POLLO.docx
@@ -3,140 +3,625 @@
 <w:document xmlns:wpc="http://schemas.microsoft.com/office/word/2010/wordprocessingCanvas" xmlns:cx="http://schemas.microsoft.com/office/drawing/2014/chartex" xmlns:cx1="http://schemas.microsoft.com/office/drawing/2015/9/8/chartex" xmlns:cx2="http://schemas.microsoft.com/office/drawing/2015/10/21/chartex" xmlns:cx3="http://schemas.microsoft.com/office/drawing/2016/5/9/chartex" xmlns:cx4="http://schemas.microsoft.com/office/drawing/2016/5/10/chartex" xmlns:cx5="http://schemas.microsoft.com/office/drawing/2016/5/11/chartex" xmlns:cx6="http://schemas.microsoft.com/office/drawing/2016/5/12/chartex" xmlns:cx7="http://schemas.microsoft.com/office/drawing/2016/5/13/chartex" xmlns:cx8="http://schemas.microsoft.com/office/drawing/2016/5/14/chartex" xmlns:mc="http://schemas.openxmlformats.org/markup-compatibility/2006" xmlns:aink="http://schemas.microsoft.com/office/drawing/2016/ink" xmlns:am3d="http://schemas.microsoft.com/office/drawing/2017/model3d" xmlns:o="urn:schemas-microsoft-com:office:office" xmlns:oel="http://schemas.microsoft.com/office/2019/extlst" xmlns:r="http://schemas.openxmlformats.org/officeDocument/2006/relationships" xmlns:m="http://schemas.openxmlformats.org/officeDocument/2006/math" xmlns:v="urn:schemas-microsoft-com:vml" xmlns:wp14="http://schemas.microsoft.com/office/word/2010/wordprocessingDrawing" xmlns:wp="http://schemas.openxmlformats.org/drawingml/2006/wordprocessingDrawing" xmlns:w10="urn:schemas-microsoft-com:office:word" xmlns:w="http://schemas.openxmlformats.org/wordprocessingml/2006/main" xmlns:w14="http://schemas.microsoft.com/office/word/2010/wordml" xmlns:w15="http://schemas.microsoft.com/office/word/2012/wordml" xmlns:w16cex="http://schemas.microsoft.com/office/word/2018/wordml/cex" xmlns:w16cid="http://schemas.microsoft.com/office/word/2016/wordml/cid" xmlns:w16="http://schemas.microsoft.com/office/word/2018/wordml" xmlns:w16du="http://schemas.microsoft.com/office/word/2023/wordml/word16du" xmlns:w16sdtdh="http://schemas.microsoft.com/office/word/2020/wordml/sdtdatahash" xmlns:w16sdtfl="http://schemas.microsoft.com/office/word/2024/wordml/sdtformatlock" xmlns:w16se="http://schemas.microsoft.com/office/word/2015/wordml/symex" xmlns:wpg="http://schemas.microsoft.com/office/word/2010/wordprocessingGroup" xmlns:wpi="http://schemas.microsoft.com/office/word/2010/wordprocessingInk" xmlns:wne="http://schemas.microsoft.com/office/word/2006/wordml" xmlns:wps="http://schemas.microsoft.com/office/word/2010/wordprocessingShape" mc:Ignorable="w14 w15 w16se w16cid w16 w16cex w16sdtdh w16sdtfl w16du wp14">
   <w:body>
     <w:p>
-      <w:r>
-        <w:t>SALE TODO EL POLLO</w:t>
-      </w:r>
-    </w:p>
-    <w:p>
-      <w:r>
-        <w:t>RECOGER TODO EL EQUIPO. ( BEBEDEROS Y COMEDEROS)</w:t>
+      <w:pPr>
+        <w:rPr>
+          <w:b/>
+          <w:bCs/>
+        </w:rPr>
+      </w:pPr>
+      <w:r>
+        <w:rPr>
+          <w:b/>
+          <w:bCs/>
+        </w:rPr>
+        <w:t>ALISTAMIENTO</w:t>
+      </w:r>
+    </w:p>
+    <w:p>
+      <w:r>
+        <w:rPr>
+          <w:b/>
+          <w:bCs/>
+        </w:rPr>
+        <w:t>Retiro5</w:t>
+      </w:r>
+    </w:p>
+    <w:p>
+      <w:pPr>
+        <w:numPr>
+          <w:ilvl w:val="0"/>
+          <w:numId w:val="1"/>
+        </w:numPr>
+      </w:pPr>
+      <w:r>
+        <w:t>Recoger Equipo</w:t>
+      </w:r>
+      <w:r>
+        <w:t xml:space="preserve">. </w:t>
+      </w:r>
+      <w:r>
+        <w:t xml:space="preserve"> </w:t>
+      </w:r>
+      <w:r>
+        <w:rPr>
+          <w:highlight w:val="yellow"/>
+        </w:rPr>
+        <w:t>( BEBEDEROS Y COMEDEROS)</w:t>
+      </w:r>
+    </w:p>
+    <w:p>
+      <w:pPr>
+        <w:numPr>
+          <w:ilvl w:val="0"/>
+          <w:numId w:val="1"/>
+        </w:numPr>
+        <w:rPr>
+          <w:highlight w:val="yellow"/>
+        </w:rPr>
+      </w:pPr>
+      <w:r>
+        <w:rPr>
+          <w:highlight w:val="yellow"/>
+        </w:rPr>
+        <w:t>Lavar Equipo (Bebederos / Comederos)</w:t>
+      </w:r>
+    </w:p>
+    <w:p>
+      <w:pPr>
+        <w:numPr>
+          <w:ilvl w:val="0"/>
+          <w:numId w:val="1"/>
+        </w:numPr>
+      </w:pPr>
+      <w:r>
+        <w:t>Barrer Pluma</w:t>
+      </w:r>
+    </w:p>
+    <w:p>
+      <w:pPr>
+        <w:numPr>
+          <w:ilvl w:val="0"/>
+          <w:numId w:val="1"/>
+        </w:numPr>
+      </w:pPr>
+      <w:r>
+        <w:t>Sacar Caracha</w:t>
+      </w:r>
+    </w:p>
+    <w:p>
+      <w:pPr>
+        <w:numPr>
+          <w:ilvl w:val="0"/>
+          <w:numId w:val="1"/>
+        </w:numPr>
+      </w:pPr>
+      <w:r>
+        <w:t>Amontonar pollinaza 8 dias y registrar temperatura interna</w:t>
+      </w:r>
+    </w:p>
+    <w:p>
+      <w:pPr>
+        <w:numPr>
+          <w:ilvl w:val="0"/>
+          <w:numId w:val="1"/>
+        </w:numPr>
+      </w:pPr>
+      <w:r>
+        <w:t>Retiro de Pollinaza Reusada en Exceso</w:t>
+      </w:r>
+    </w:p>
+    <w:p>
+      <w:r>
+        <w:rPr>
+          <w:b/>
+          <w:bCs/>
+        </w:rPr>
+        <w:t>Desinfeccion</w:t>
+      </w:r>
+      <w:r>
+        <w:rPr>
+          <w:b/>
+          <w:bCs/>
+        </w:rPr>
+        <w:t xml:space="preserve"> 8 </w:t>
+      </w:r>
+    </w:p>
+    <w:p>
+      <w:pPr>
+        <w:numPr>
+          <w:ilvl w:val="0"/>
+          <w:numId w:val="2"/>
+        </w:numPr>
+      </w:pPr>
+      <w:r>
+        <w:t>Fumiga Coquito 1</w:t>
+      </w:r>
+    </w:p>
+    <w:p>
+      <w:pPr>
+        <w:numPr>
+          <w:ilvl w:val="0"/>
+          <w:numId w:val="2"/>
+        </w:numPr>
+      </w:pPr>
+      <w:r>
+        <w:t>Fumiga Coquito 2</w:t>
+      </w:r>
+    </w:p>
+    <w:p>
+      <w:pPr>
+        <w:numPr>
+          <w:ilvl w:val="0"/>
+          <w:numId w:val="2"/>
+        </w:numPr>
+      </w:pPr>
+      <w:r>
+        <w:t>Barrer / Lavado Galpon</w:t>
+      </w:r>
+    </w:p>
+    <w:p>
+      <w:pPr>
+        <w:numPr>
+          <w:ilvl w:val="0"/>
+          <w:numId w:val="2"/>
+        </w:numPr>
+      </w:pPr>
+      <w:r>
+        <w:t>Barrer malla y limpiar techo</w:t>
+      </w:r>
+    </w:p>
+    <w:p>
+      <w:pPr>
+        <w:numPr>
+          <w:ilvl w:val="0"/>
+          <w:numId w:val="2"/>
+        </w:numPr>
+      </w:pPr>
+      <w:r>
+        <w:t>Reparaciones locativas</w:t>
+      </w:r>
+    </w:p>
+    <w:p>
+      <w:pPr>
+        <w:numPr>
+          <w:ilvl w:val="0"/>
+          <w:numId w:val="2"/>
+        </w:numPr>
+      </w:pPr>
+      <w:r>
+        <w:t>Lavar tanques de agua y purgar lineas</w:t>
+      </w:r>
+    </w:p>
+    <w:p>
+      <w:pPr>
+        <w:numPr>
+          <w:ilvl w:val="0"/>
+          <w:numId w:val="2"/>
+        </w:numPr>
+      </w:pPr>
+      <w:r>
+        <w:t>Calear</w:t>
+      </w:r>
+    </w:p>
+    <w:p>
+      <w:pPr>
+        <w:numPr>
+          <w:ilvl w:val="0"/>
+          <w:numId w:val="2"/>
+        </w:numPr>
+      </w:pPr>
+      <w:r>
+        <w:t>Fumiga Desinfectante</w:t>
+      </w:r>
+    </w:p>
+    <w:p>
+      <w:r>
+        <w:rPr>
+          <w:b/>
+          <w:bCs/>
+        </w:rPr>
+        <w:t>Instalacion5</w:t>
+      </w:r>
+    </w:p>
+    <w:p>
+      <w:pPr>
+        <w:numPr>
+          <w:ilvl w:val="0"/>
+          <w:numId w:val="3"/>
+        </w:numPr>
+      </w:pPr>
+      <w:r>
+        <w:t>Cisco Nuevo (en la mitad sin cama usada)</w:t>
+      </w:r>
+    </w:p>
+    <w:p>
+      <w:pPr>
+        <w:numPr>
+          <w:ilvl w:val="0"/>
+          <w:numId w:val="3"/>
+        </w:numPr>
+      </w:pPr>
+      <w:r>
+        <w:t>Divisiones</w:t>
+      </w:r>
+    </w:p>
+    <w:p>
+      <w:pPr>
+        <w:numPr>
+          <w:ilvl w:val="0"/>
+          <w:numId w:val="3"/>
+        </w:numPr>
+      </w:pPr>
+      <w:r>
+        <w:t>Instalar Calentadoras</w:t>
+      </w:r>
+    </w:p>
+    <w:p>
+      <w:pPr>
+        <w:numPr>
+          <w:ilvl w:val="0"/>
+          <w:numId w:val="3"/>
+        </w:numPr>
+      </w:pPr>
+      <w:r>
+        <w:t>Meter Bebederos de Volteo y Comederos Babies</w:t>
+      </w:r>
+    </w:p>
+    <w:p>
+      <w:pPr>
+        <w:numPr>
+          <w:ilvl w:val="0"/>
+          <w:numId w:val="3"/>
+        </w:numPr>
+        <w:rPr>
+          <w:highlight w:val="yellow"/>
+        </w:rPr>
+      </w:pPr>
+      <w:r>
+        <w:rPr>
+          <w:highlight w:val="yellow"/>
+        </w:rPr>
+        <w:t>Encortinar</w:t>
+      </w:r>
+    </w:p>
+    <w:p>
+      <w:pPr>
+        <w:ind w:left="720"/>
+      </w:pPr>
+    </w:p>
+    <w:p>
+      <w:r>
+        <w:rPr>
+          <w:b/>
+          <w:bCs/>
+        </w:rPr>
+        <w:t>Recibimiento5</w:t>
+      </w:r>
+    </w:p>
+    <w:p>
+      <w:pPr>
+        <w:numPr>
+          <w:ilvl w:val="0"/>
+          <w:numId w:val="4"/>
+        </w:numPr>
+      </w:pPr>
+      <w:r>
+        <w:t>Precalentar 8h antes de la llegada</w:t>
+      </w:r>
+      <w:r>
+        <w:t xml:space="preserve"> </w:t>
+      </w:r>
+      <w:r>
+        <w:rPr>
+          <w:highlight w:val="yellow"/>
+        </w:rPr>
+        <w:t>(32 GRADOS)</w:t>
+      </w:r>
+    </w:p>
+    <w:p>
+      <w:pPr>
+        <w:numPr>
+          <w:ilvl w:val="0"/>
+          <w:numId w:val="4"/>
+        </w:numPr>
+      </w:pPr>
+      <w:r>
+        <w:t>Purgar Lineas</w:t>
+      </w:r>
+    </w:p>
+    <w:p>
+      <w:pPr>
+        <w:numPr>
+          <w:ilvl w:val="0"/>
+          <w:numId w:val="4"/>
+        </w:numPr>
+      </w:pPr>
+      <w:r>
+        <w:t>Neutrar el Agua de Bebida</w:t>
+      </w:r>
+    </w:p>
+    <w:p>
+      <w:pPr>
+        <w:numPr>
+          <w:ilvl w:val="0"/>
+          <w:numId w:val="4"/>
+        </w:numPr>
+      </w:pPr>
+      <w:r>
+        <w:t>Verificar Temperatura</w:t>
+      </w:r>
+    </w:p>
+    <w:p>
+      <w:pPr>
+        <w:numPr>
+          <w:ilvl w:val="0"/>
+          <w:numId w:val="4"/>
+        </w:numPr>
+      </w:pPr>
+      <w:r>
+        <w:lastRenderedPageBreak/>
+        <w:t>Llegada del Pollito</w:t>
+      </w:r>
+    </w:p>
+    <w:p>
+      <w:pPr>
+        <w:rPr>
+          <w:b/>
+          <w:bCs/>
+        </w:rPr>
+      </w:pPr>
+      <w:r>
+        <w:rPr>
+          <w:b/>
+          <w:bCs/>
+        </w:rPr>
+        <w:t>ACTIVIDADES DEL LOTE</w:t>
+      </w:r>
+    </w:p>
+    <w:p/>
+    <w:p>
+      <w:r>
+        <w:rPr>
+          <w:b/>
+          <w:bCs/>
+        </w:rPr>
+        <w:t>DIA 3</w:t>
+      </w:r>
+      <w:r>
+        <w:t xml:space="preserve"> </w:t>
+      </w:r>
+      <w:r>
+        <w:t xml:space="preserve">AMPLIACION </w:t>
+      </w:r>
+    </w:p>
+    <w:p>
+      <w:r>
+        <w:rPr>
+          <w:b/>
+          <w:bCs/>
+        </w:rPr>
+        <w:t>DIA 8</w:t>
+      </w:r>
+      <w:r>
+        <w:t xml:space="preserve"> </w:t>
+      </w:r>
+      <w:r>
+        <w:t xml:space="preserve">AMPLIACION </w:t>
+      </w:r>
+    </w:p>
+    <w:p>
+      <w:r>
+        <w:rPr>
+          <w:b/>
+          <w:bCs/>
+        </w:rPr>
+        <w:t>DIA 9</w:t>
+      </w:r>
+      <w:r>
+        <w:t xml:space="preserve"> </w:t>
+      </w:r>
+      <w:r>
+        <w:t xml:space="preserve">VACUNANCION </w:t>
+      </w:r>
+      <w:r>
+        <w:t>NEWCASTLE</w:t>
+      </w:r>
+      <w:r>
+        <w:t xml:space="preserve"> (10)</w:t>
+      </w:r>
+      <w:r>
+        <w:t xml:space="preserve"> /</w:t>
+      </w:r>
+      <w:r>
+        <w:t xml:space="preserve"> Y GUMBORO </w:t>
+      </w:r>
+      <w:r>
+        <w:t>(8)</w:t>
+      </w:r>
+    </w:p>
+    <w:p>
+      <w:r>
+        <w:rPr>
+          <w:b/>
+          <w:bCs/>
+        </w:rPr>
+        <w:t>DIA 11</w:t>
+      </w:r>
+      <w:r>
+        <w:t xml:space="preserve"> </w:t>
+      </w:r>
+      <w:r>
+        <w:t xml:space="preserve">SACAR BEBEDEROS BABIES </w:t>
+      </w:r>
+    </w:p>
+    <w:p>
+      <w:r>
+        <w:rPr>
+          <w:b/>
+          <w:bCs/>
+        </w:rPr>
+        <w:t>DIA 15</w:t>
+      </w:r>
+      <w:r>
+        <w:t xml:space="preserve"> AMPLIACION Y</w:t>
+      </w:r>
+      <w:r>
+        <w:t xml:space="preserve"> RETIRADA CALENTADORAS </w:t>
+      </w:r>
+    </w:p>
+    <w:p>
+      <w:r>
+        <w:rPr>
+          <w:b/>
+          <w:bCs/>
+        </w:rPr>
+        <w:t>DIA 20</w:t>
+      </w:r>
+      <w:r>
+        <w:t xml:space="preserve"> </w:t>
+      </w:r>
+      <w:r>
+        <w:t xml:space="preserve">AMPLIACION </w:t>
+      </w:r>
+    </w:p>
+    <w:p>
+      <w:r>
+        <w:rPr>
+          <w:b/>
+          <w:bCs/>
+        </w:rPr>
+        <w:t>DIA 20</w:t>
+      </w:r>
+      <w:r>
+        <w:t xml:space="preserve"> </w:t>
+      </w:r>
+      <w:r>
+        <w:t xml:space="preserve">DESENCORTINA </w:t>
+      </w:r>
+    </w:p>
+    <w:p>
+      <w:r>
+        <w:rPr>
+          <w:b/>
+          <w:bCs/>
+        </w:rPr>
+        <w:t>DIA 2</w:t>
+      </w:r>
+      <w:r>
+        <w:rPr>
+          <w:b/>
+          <w:bCs/>
+        </w:rPr>
+        <w:t>1</w:t>
+      </w:r>
+      <w:r>
+        <w:t xml:space="preserve"> </w:t>
+      </w:r>
+      <w:r>
+        <w:t xml:space="preserve">BAJAR HEMBRAS </w:t>
+      </w:r>
+    </w:p>
+    <w:p/>
+    <w:p/>
+    <w:p>
+      <w:pPr>
+        <w:rPr>
+          <w:b/>
+          <w:bCs/>
+          <w:sz w:val="24"/>
+          <w:szCs w:val="24"/>
+        </w:rPr>
+      </w:pPr>
+      <w:r>
+        <w:rPr>
+          <w:b/>
+          <w:bCs/>
+          <w:sz w:val="24"/>
+          <w:szCs w:val="24"/>
+        </w:rPr>
+        <w:t>RUTINA</w:t>
+      </w:r>
+      <w:r>
+        <w:rPr>
+          <w:b/>
+          <w:bCs/>
+          <w:sz w:val="24"/>
+          <w:szCs w:val="24"/>
+        </w:rPr>
+        <w:t xml:space="preserve"> - </w:t>
+      </w:r>
+      <w:r>
+        <w:rPr>
+          <w:b/>
+          <w:bCs/>
+          <w:sz w:val="24"/>
+          <w:szCs w:val="24"/>
+        </w:rPr>
+        <w:t>DIARIO</w:t>
+      </w:r>
+    </w:p>
+    <w:p>
+      <w:r>
+        <w:rPr>
+          <w:b/>
+          <w:bCs/>
+        </w:rPr>
+        <w:t>AGUA</w:t>
+      </w:r>
+      <w:r>
+        <w:t xml:space="preserve">: </w:t>
+      </w:r>
+      <w:r>
+        <w:t>CLORAR TANQUE PRINCIPAL (CADA 3 DIAS) 24H ANTES SE SULFATA</w:t>
+      </w:r>
+    </w:p>
+    <w:p>
+      <w:r>
+        <w:t>MEDIR EL</w:t>
+      </w:r>
+      <w:r>
+        <w:t xml:space="preserve"> CLORO Y PH  EN LAS LINEAS, TANQUES </w:t>
+      </w:r>
+    </w:p>
+    <w:p>
+      <w:r>
+        <w:t>PURGAR LINEA</w:t>
+      </w:r>
+    </w:p>
+    <w:p/>
+    <w:p>
+      <w:r>
+        <w:rPr>
+          <w:b/>
+          <w:bCs/>
+        </w:rPr>
+        <w:t>COMIDA</w:t>
       </w:r>
       <w:r>
         <w:br/>
-        <w:t>LAVA EL EQUIPO</w:t>
+        <w:t>5-5:30 AM       70%</w:t>
+      </w:r>
+    </w:p>
+    <w:p>
+      <w:r>
+        <w:t>3-4 PM       30%</w:t>
       </w:r>
     </w:p>
     <w:p/>
     <w:p>
       <w:r>
-        <w:t>BARRE LA PLUMA</w:t>
-      </w:r>
-    </w:p>
-    <w:p>
-      <w:r>
-        <w:t>SACAR LA CARACHA</w:t>
-      </w:r>
-    </w:p>
-    <w:p>
-      <w:r>
-        <w:t>AMONTONA  ( 8 DIAS)</w:t>
-      </w:r>
-    </w:p>
-    <w:p/>
-    <w:p>
-      <w:r>
-        <w:t>FUMIGA PARA EL COQUITO</w:t>
-      </w:r>
-    </w:p>
-    <w:p>
-      <w:r>
-        <w:t>BARRE</w:t>
-      </w:r>
-    </w:p>
-    <w:p>
-      <w:r>
-        <w:t>CALEA</w:t>
-      </w:r>
-    </w:p>
-    <w:p/>
-    <w:p>
-      <w:r>
-        <w:t>CISCO NUEVO</w:t>
-      </w:r>
-      <w:r>
-        <w:br/>
-        <w:t xml:space="preserve">DIVISIONES </w:t>
-      </w:r>
-    </w:p>
-    <w:p>
-      <w:r>
-        <w:t>INSTALAR CALENTADORAS</w:t>
-      </w:r>
-    </w:p>
-    <w:p>
-      <w:r>
-        <w:t>SE METE EL EQUIPO (BEBEDEROS DE VOLTEO  Y COMEDEROS BABIES)</w:t>
-      </w:r>
-    </w:p>
-    <w:p>
-      <w:r>
-        <w:t>ENCORTINA</w:t>
-      </w:r>
-      <w:r>
-        <w:br/>
-      </w:r>
-      <w:r>
-        <w:br/>
-        <w:t>---------</w:t>
-      </w:r>
-    </w:p>
-    <w:p>
-      <w:r>
-        <w:t>PRECALENTAR 8H ANTES (32 GRADOS)</w:t>
-      </w:r>
-      <w:r>
-        <w:br/>
-        <w:t>LLEGA EL POLLO</w:t>
-      </w:r>
-    </w:p>
-    <w:p/>
-    <w:p>
-      <w:r>
-        <w:t>AMPLIACION (DIA 3)</w:t>
-      </w:r>
-    </w:p>
-    <w:p/>
-    <w:p>
-      <w:r>
-        <w:t>AMPLIACION (DIA 8)</w:t>
-      </w:r>
-    </w:p>
-    <w:p>
-      <w:r>
-        <w:t>VACUNANCION NEWCASTLE  / Y GUMBORO (DIA 9)</w:t>
-      </w:r>
-    </w:p>
-    <w:p>
-      <w:r>
-        <w:t>SACAR BEBEDEROS BABIES (DIA 11)</w:t>
-      </w:r>
-    </w:p>
-    <w:p>
-      <w:r>
-        <w:t xml:space="preserve">AMPLIACION </w:t>
-      </w:r>
-      <w:r>
-        <w:t xml:space="preserve"> Y RETIRADA CALENTADORAS </w:t>
-      </w:r>
-      <w:r>
-        <w:t>(DIA 15)</w:t>
-      </w:r>
-    </w:p>
-    <w:p/>
-    <w:p>
-      <w:r>
-        <w:t>AMPLIACION (DIA 20)</w:t>
-      </w:r>
-    </w:p>
-    <w:p>
-      <w:r>
-        <w:t>DESENCORTINA (DIA 20)</w:t>
-      </w:r>
-    </w:p>
-    <w:p>
-      <w:r>
-        <w:lastRenderedPageBreak/>
+        <w:rPr>
+          <w:b/>
+          <w:bCs/>
+        </w:rPr>
         <w:t>FUMIGACION</w:t>
+      </w:r>
+      <w:r>
+        <w:rPr>
+          <w:b/>
+          <w:bCs/>
+        </w:rPr>
+        <w:t xml:space="preserve"> 4pm</w:t>
       </w:r>
       <w:r>
         <w:br/>
@@ -145,95 +630,83 @@
       <w:r>
         <w:t>. 9AM.  4M</w:t>
       </w:r>
-      <w:r>
-        <w:br/>
-      </w:r>
-      <w:r>
-        <w:br/>
-        <w:t>CIPERMETRINA (DIARIO) (PARA LA MOSCA) ALREDEDOR DEL GALPON</w:t>
-      </w:r>
-      <w:r>
-        <w:t>.  5PM</w:t>
+    </w:p>
+    <w:p>
+      <w:r>
+        <w:t>*NOVABRONCOL O VIRCONX ( CASOS ESPECIALES)</w:t>
       </w:r>
     </w:p>
     <w:p/>
     <w:p>
       <w:r>
-        <w:t>*</w:t>
-      </w:r>
-      <w:r>
-        <w:t>NOVABRONCOL O VIRCONX ( CASOS ESPECIALES)</w:t>
+        <w:t>REVOLCAR CAMA (DIARIO)</w:t>
       </w:r>
     </w:p>
     <w:p/>
-    <w:p/>
-    <w:p>
-      <w:r>
-        <w:t>COMIDA</w:t>
-      </w:r>
-      <w:r>
-        <w:br/>
-        <w:t>5-5:30 AM       70%</w:t>
-      </w:r>
-    </w:p>
-    <w:p/>
-    <w:p>
-      <w:r>
-        <w:t>3-4 PM       30%</w:t>
-      </w:r>
-    </w:p>
-    <w:p/>
-    <w:p/>
-    <w:p>
-      <w:r>
-        <w:t>AGUA</w:t>
-      </w:r>
-    </w:p>
-    <w:p/>
-    <w:p>
-      <w:r>
-        <w:t>CLORAR TANQUE PRINCIPAL (CADA 3 DIAS) 24H ANTES SE SULFATA</w:t>
-      </w:r>
-    </w:p>
-    <w:p/>
-    <w:p>
-      <w:r>
-        <w:t>SE MIDE EL CLORO Y PH  EN LAS LINEAS, TANQUES ( DIARIO)</w:t>
-      </w:r>
-    </w:p>
-    <w:p/>
-    <w:p>
-      <w:r>
+    <w:p>
+      <w:r>
+        <w:rPr>
+          <w:b/>
+          <w:bCs/>
+        </w:rPr>
         <w:t>CONTROL DE PEDILUBIOS</w:t>
       </w:r>
       <w:r>
         <w:br/>
         <w:t>CREOLINA (DIARIO O 2 DIAS)</w:t>
       </w:r>
+    </w:p>
+    <w:p>
+      <w:r>
+        <w:rPr>
+          <w:b/>
+          <w:bCs/>
+          <w:sz w:val="24"/>
+          <w:szCs w:val="24"/>
+        </w:rPr>
+        <w:lastRenderedPageBreak/>
+        <w:t>RUTINA</w:t>
+      </w:r>
+      <w:r>
+        <w:rPr>
+          <w:b/>
+          <w:bCs/>
+          <w:sz w:val="24"/>
+          <w:szCs w:val="24"/>
+        </w:rPr>
+        <w:t xml:space="preserve"> - SEMANAL</w:t>
+      </w:r>
+    </w:p>
+    <w:p>
       <w:r>
         <w:br/>
       </w:r>
       <w:r>
         <w:br/>
+      </w:r>
+      <w:r>
+        <w:rPr>
+          <w:b/>
+          <w:bCs/>
+        </w:rPr>
         <w:t>CONTROL ROEDORES</w:t>
       </w:r>
       <w:r>
         <w:br/>
-        <w:t>CICARIO (DIARIO)</w:t>
+        <w:t xml:space="preserve">CICARIO </w:t>
+      </w:r>
+    </w:p>
+    <w:p>
+      <w:r>
+        <w:t>LAVAR FILTROS</w:t>
+      </w:r>
+    </w:p>
+    <w:p>
+      <w:r>
+        <w:t>CIPERMETRINA (DIARIO) (PARA LA MOSCA) ALREDEDOR DEL GALPON.  5PM</w:t>
       </w:r>
     </w:p>
     <w:p/>
-    <w:p>
-      <w:r>
-        <w:t>REVOLCAR CAMA (DIARIO)</w:t>
-      </w:r>
-    </w:p>
-    <w:p/>
-    <w:p>
-      <w:r>
-        <w:t>LAVAR FILTROS</w:t>
-      </w:r>
-    </w:p>
     <w:sectPr>
       <w:pgSz w:w="12240" w:h="15840"/>
       <w:pgMar w:top="1417" w:right="1701" w:bottom="1417" w:left="1701" w:header="708" w:footer="708" w:gutter="0"/>
@@ -242,6 +715,475 @@
     </w:sectPr>
   </w:body>
 </w:document>
+</file>
+
+<file path=word/numbering.xml><?xml version="1.0" encoding="utf-8"?>
+<w:numbering xmlns:wpc="http://schemas.microsoft.com/office/word/2010/wordprocessingCanvas" xmlns:cx="http://schemas.microsoft.com/office/drawing/2014/chartex" xmlns:cx1="http://schemas.microsoft.com/office/drawing/2015/9/8/chartex" xmlns:cx2="http://schemas.microsoft.com/office/drawing/2015/10/21/chartex" xmlns:cx3="http://schemas.microsoft.com/office/drawing/2016/5/9/chartex" xmlns:cx4="http://schemas.microsoft.com/office/drawing/2016/5/10/chartex" xmlns:cx5="http://schemas.microsoft.com/office/drawing/2016/5/11/chartex" xmlns:cx6="http://schemas.microsoft.com/office/drawing/2016/5/12/chartex" xmlns:cx7="http://schemas.microsoft.com/office/drawing/2016/5/13/chartex" xmlns:cx8="http://schemas.microsoft.com/office/drawing/2016/5/14/chartex" xmlns:mc="http://schemas.openxmlformats.org/markup-compatibility/2006" xmlns:aink="http://schemas.microsoft.com/office/drawing/2016/ink" xmlns:am3d="http://schemas.microsoft.com/office/drawing/2017/model3d" xmlns:o="urn:schemas-microsoft-com:office:office" xmlns:oel="http://schemas.microsoft.com/office/2019/extlst" xmlns:r="http://schemas.openxmlformats.org/officeDocument/2006/relationships" xmlns:m="http://schemas.openxmlformats.org/officeDocument/2006/math" xmlns:v="urn:schemas-microsoft-com:vml" xmlns:wp14="http://schemas.microsoft.com/office/word/2010/wordprocessingDrawing" xmlns:wp="http://schemas.openxmlformats.org/drawingml/2006/wordprocessingDrawing" xmlns:w10="urn:schemas-microsoft-com:office:word" xmlns:w="http://schemas.openxmlformats.org/wordprocessingml/2006/main" xmlns:w14="http://schemas.microsoft.com/office/word/2010/wordml" xmlns:w15="http://schemas.microsoft.com/office/word/2012/wordml" xmlns:w16cex="http://schemas.microsoft.com/office/word/2018/wordml/cex" xmlns:w16cid="http://schemas.microsoft.com/office/word/2016/wordml/cid" xmlns:w16="http://schemas.microsoft.com/office/word/2018/wordml" xmlns:w16du="http://schemas.microsoft.com/office/word/2023/wordml/word16du" xmlns:w16sdtdh="http://schemas.microsoft.com/office/word/2020/wordml/sdtdatahash" xmlns:w16sdtfl="http://schemas.microsoft.com/office/word/2024/wordml/sdtformatlock" xmlns:w16se="http://schemas.microsoft.com/office/word/2015/wordml/symex" xmlns:wpg="http://schemas.microsoft.com/office/word/2010/wordprocessingGroup" xmlns:wpi="http://schemas.microsoft.com/office/word/2010/wordprocessingInk" xmlns:wne="http://schemas.microsoft.com/office/word/2006/wordml" xmlns:wps="http://schemas.microsoft.com/office/word/2010/wordprocessingShape" mc:Ignorable="w14 w15 w16se w16cid w16 w16cex w16sdtdh w16sdtfl w16du wp14">
+  <w:abstractNum w:abstractNumId="0" w15:restartNumberingAfterBreak="0">
+    <w:nsid w:val="29DA570D"/>
+    <w:multiLevelType w:val="multilevel"/>
+    <w:tmpl w:val="98D84534"/>
+    <w:lvl w:ilvl="0">
+      <w:start w:val="1"/>
+      <w:numFmt w:val="decimal"/>
+      <w:lvlText w:val="%1."/>
+      <w:lvlJc w:val="left"/>
+      <w:pPr>
+        <w:tabs>
+          <w:tab w:val="num" w:pos="720"/>
+        </w:tabs>
+        <w:ind w:left="720" w:hanging="360"/>
+      </w:pPr>
+    </w:lvl>
+    <w:lvl w:ilvl="1" w:tentative="1">
+      <w:start w:val="1"/>
+      <w:numFmt w:val="decimal"/>
+      <w:lvlText w:val="%2."/>
+      <w:lvlJc w:val="left"/>
+      <w:pPr>
+        <w:tabs>
+          <w:tab w:val="num" w:pos="1440"/>
+        </w:tabs>
+        <w:ind w:left="1440" w:hanging="360"/>
+      </w:pPr>
+    </w:lvl>
+    <w:lvl w:ilvl="2" w:tentative="1">
+      <w:start w:val="1"/>
+      <w:numFmt w:val="decimal"/>
+      <w:lvlText w:val="%3."/>
+      <w:lvlJc w:val="left"/>
+      <w:pPr>
+        <w:tabs>
+          <w:tab w:val="num" w:pos="2160"/>
+        </w:tabs>
+        <w:ind w:left="2160" w:hanging="360"/>
+      </w:pPr>
+    </w:lvl>
+    <w:lvl w:ilvl="3" w:tentative="1">
+      <w:start w:val="1"/>
+      <w:numFmt w:val="decimal"/>
+      <w:lvlText w:val="%4."/>
+      <w:lvlJc w:val="left"/>
+      <w:pPr>
+        <w:tabs>
+          <w:tab w:val="num" w:pos="2880"/>
+        </w:tabs>
+        <w:ind w:left="2880" w:hanging="360"/>
+      </w:pPr>
+    </w:lvl>
+    <w:lvl w:ilvl="4" w:tentative="1">
+      <w:start w:val="1"/>
+      <w:numFmt w:val="decimal"/>
+      <w:lvlText w:val="%5."/>
+      <w:lvlJc w:val="left"/>
+      <w:pPr>
+        <w:tabs>
+          <w:tab w:val="num" w:pos="3600"/>
+        </w:tabs>
+        <w:ind w:left="3600" w:hanging="360"/>
+      </w:pPr>
+    </w:lvl>
+    <w:lvl w:ilvl="5" w:tentative="1">
+      <w:start w:val="1"/>
+      <w:numFmt w:val="decimal"/>
+      <w:lvlText w:val="%6."/>
+      <w:lvlJc w:val="left"/>
+      <w:pPr>
+        <w:tabs>
+          <w:tab w:val="num" w:pos="4320"/>
+        </w:tabs>
+        <w:ind w:left="4320" w:hanging="360"/>
+      </w:pPr>
+    </w:lvl>
+    <w:lvl w:ilvl="6" w:tentative="1">
+      <w:start w:val="1"/>
+      <w:numFmt w:val="decimal"/>
+      <w:lvlText w:val="%7."/>
+      <w:lvlJc w:val="left"/>
+      <w:pPr>
+        <w:tabs>
+          <w:tab w:val="num" w:pos="5040"/>
+        </w:tabs>
+        <w:ind w:left="5040" w:hanging="360"/>
+      </w:pPr>
+    </w:lvl>
+    <w:lvl w:ilvl="7" w:tentative="1">
+      <w:start w:val="1"/>
+      <w:numFmt w:val="decimal"/>
+      <w:lvlText w:val="%8."/>
+      <w:lvlJc w:val="left"/>
+      <w:pPr>
+        <w:tabs>
+          <w:tab w:val="num" w:pos="5760"/>
+        </w:tabs>
+        <w:ind w:left="5760" w:hanging="360"/>
+      </w:pPr>
+    </w:lvl>
+    <w:lvl w:ilvl="8" w:tentative="1">
+      <w:start w:val="1"/>
+      <w:numFmt w:val="decimal"/>
+      <w:lvlText w:val="%9."/>
+      <w:lvlJc w:val="left"/>
+      <w:pPr>
+        <w:tabs>
+          <w:tab w:val="num" w:pos="6480"/>
+        </w:tabs>
+        <w:ind w:left="6480" w:hanging="360"/>
+      </w:pPr>
+    </w:lvl>
+  </w:abstractNum>
+  <w:abstractNum w:abstractNumId="1" w15:restartNumberingAfterBreak="0">
+    <w:nsid w:val="4B5D6946"/>
+    <w:multiLevelType w:val="multilevel"/>
+    <w:tmpl w:val="FF0AEECE"/>
+    <w:lvl w:ilvl="0">
+      <w:start w:val="1"/>
+      <w:numFmt w:val="decimal"/>
+      <w:lvlText w:val="%1."/>
+      <w:lvlJc w:val="left"/>
+      <w:pPr>
+        <w:tabs>
+          <w:tab w:val="num" w:pos="720"/>
+        </w:tabs>
+        <w:ind w:left="720" w:hanging="360"/>
+      </w:pPr>
+    </w:lvl>
+    <w:lvl w:ilvl="1" w:tentative="1">
+      <w:start w:val="1"/>
+      <w:numFmt w:val="decimal"/>
+      <w:lvlText w:val="%2."/>
+      <w:lvlJc w:val="left"/>
+      <w:pPr>
+        <w:tabs>
+          <w:tab w:val="num" w:pos="1440"/>
+        </w:tabs>
+        <w:ind w:left="1440" w:hanging="360"/>
+      </w:pPr>
+    </w:lvl>
+    <w:lvl w:ilvl="2" w:tentative="1">
+      <w:start w:val="1"/>
+      <w:numFmt w:val="decimal"/>
+      <w:lvlText w:val="%3."/>
+      <w:lvlJc w:val="left"/>
+      <w:pPr>
+        <w:tabs>
+          <w:tab w:val="num" w:pos="2160"/>
+        </w:tabs>
+        <w:ind w:left="2160" w:hanging="360"/>
+      </w:pPr>
+    </w:lvl>
+    <w:lvl w:ilvl="3" w:tentative="1">
+      <w:start w:val="1"/>
+      <w:numFmt w:val="decimal"/>
+      <w:lvlText w:val="%4."/>
+      <w:lvlJc w:val="left"/>
+      <w:pPr>
+        <w:tabs>
+          <w:tab w:val="num" w:pos="2880"/>
+        </w:tabs>
+        <w:ind w:left="2880" w:hanging="360"/>
+      </w:pPr>
+    </w:lvl>
+    <w:lvl w:ilvl="4" w:tentative="1">
+      <w:start w:val="1"/>
+      <w:numFmt w:val="decimal"/>
+      <w:lvlText w:val="%5."/>
+      <w:lvlJc w:val="left"/>
+      <w:pPr>
+        <w:tabs>
+          <w:tab w:val="num" w:pos="3600"/>
+        </w:tabs>
+        <w:ind w:left="3600" w:hanging="360"/>
+      </w:pPr>
+    </w:lvl>
+    <w:lvl w:ilvl="5" w:tentative="1">
+      <w:start w:val="1"/>
+      <w:numFmt w:val="decimal"/>
+      <w:lvlText w:val="%6."/>
+      <w:lvlJc w:val="left"/>
+      <w:pPr>
+        <w:tabs>
+          <w:tab w:val="num" w:pos="4320"/>
+        </w:tabs>
+        <w:ind w:left="4320" w:hanging="360"/>
+      </w:pPr>
+    </w:lvl>
+    <w:lvl w:ilvl="6" w:tentative="1">
+      <w:start w:val="1"/>
+      <w:numFmt w:val="decimal"/>
+      <w:lvlText w:val="%7."/>
+      <w:lvlJc w:val="left"/>
+      <w:pPr>
+        <w:tabs>
+          <w:tab w:val="num" w:pos="5040"/>
+        </w:tabs>
+        <w:ind w:left="5040" w:hanging="360"/>
+      </w:pPr>
+    </w:lvl>
+    <w:lvl w:ilvl="7" w:tentative="1">
+      <w:start w:val="1"/>
+      <w:numFmt w:val="decimal"/>
+      <w:lvlText w:val="%8."/>
+      <w:lvlJc w:val="left"/>
+      <w:pPr>
+        <w:tabs>
+          <w:tab w:val="num" w:pos="5760"/>
+        </w:tabs>
+        <w:ind w:left="5760" w:hanging="360"/>
+      </w:pPr>
+    </w:lvl>
+    <w:lvl w:ilvl="8" w:tentative="1">
+      <w:start w:val="1"/>
+      <w:numFmt w:val="decimal"/>
+      <w:lvlText w:val="%9."/>
+      <w:lvlJc w:val="left"/>
+      <w:pPr>
+        <w:tabs>
+          <w:tab w:val="num" w:pos="6480"/>
+        </w:tabs>
+        <w:ind w:left="6480" w:hanging="360"/>
+      </w:pPr>
+    </w:lvl>
+  </w:abstractNum>
+  <w:abstractNum w:abstractNumId="2" w15:restartNumberingAfterBreak="0">
+    <w:nsid w:val="6DC15C2A"/>
+    <w:multiLevelType w:val="multilevel"/>
+    <w:tmpl w:val="17546A58"/>
+    <w:lvl w:ilvl="0">
+      <w:start w:val="1"/>
+      <w:numFmt w:val="decimal"/>
+      <w:lvlText w:val="%1."/>
+      <w:lvlJc w:val="left"/>
+      <w:pPr>
+        <w:tabs>
+          <w:tab w:val="num" w:pos="720"/>
+        </w:tabs>
+        <w:ind w:left="720" w:hanging="360"/>
+      </w:pPr>
+    </w:lvl>
+    <w:lvl w:ilvl="1" w:tentative="1">
+      <w:start w:val="1"/>
+      <w:numFmt w:val="decimal"/>
+      <w:lvlText w:val="%2."/>
+      <w:lvlJc w:val="left"/>
+      <w:pPr>
+        <w:tabs>
+          <w:tab w:val="num" w:pos="1440"/>
+        </w:tabs>
+        <w:ind w:left="1440" w:hanging="360"/>
+      </w:pPr>
+    </w:lvl>
+    <w:lvl w:ilvl="2" w:tentative="1">
+      <w:start w:val="1"/>
+      <w:numFmt w:val="decimal"/>
+      <w:lvlText w:val="%3."/>
+      <w:lvlJc w:val="left"/>
+      <w:pPr>
+        <w:tabs>
+          <w:tab w:val="num" w:pos="2160"/>
+        </w:tabs>
+        <w:ind w:left="2160" w:hanging="360"/>
+      </w:pPr>
+    </w:lvl>
+    <w:lvl w:ilvl="3" w:tentative="1">
+      <w:start w:val="1"/>
+      <w:numFmt w:val="decimal"/>
+      <w:lvlText w:val="%4."/>
+      <w:lvlJc w:val="left"/>
+      <w:pPr>
+        <w:tabs>
+          <w:tab w:val="num" w:pos="2880"/>
+        </w:tabs>
+        <w:ind w:left="2880" w:hanging="360"/>
+      </w:pPr>
+    </w:lvl>
+    <w:lvl w:ilvl="4" w:tentative="1">
+      <w:start w:val="1"/>
+      <w:numFmt w:val="decimal"/>
+      <w:lvlText w:val="%5."/>
+      <w:lvlJc w:val="left"/>
+      <w:pPr>
+        <w:tabs>
+          <w:tab w:val="num" w:pos="3600"/>
+        </w:tabs>
+        <w:ind w:left="3600" w:hanging="360"/>
+      </w:pPr>
+    </w:lvl>
+    <w:lvl w:ilvl="5" w:tentative="1">
+      <w:start w:val="1"/>
+      <w:numFmt w:val="decimal"/>
+      <w:lvlText w:val="%6."/>
+      <w:lvlJc w:val="left"/>
+      <w:pPr>
+        <w:tabs>
+          <w:tab w:val="num" w:pos="4320"/>
+        </w:tabs>
+        <w:ind w:left="4320" w:hanging="360"/>
+      </w:pPr>
+    </w:lvl>
+    <w:lvl w:ilvl="6" w:tentative="1">
+      <w:start w:val="1"/>
+      <w:numFmt w:val="decimal"/>
+      <w:lvlText w:val="%7."/>
+      <w:lvlJc w:val="left"/>
+      <w:pPr>
+        <w:tabs>
+          <w:tab w:val="num" w:pos="5040"/>
+        </w:tabs>
+        <w:ind w:left="5040" w:hanging="360"/>
+      </w:pPr>
+    </w:lvl>
+    <w:lvl w:ilvl="7" w:tentative="1">
+      <w:start w:val="1"/>
+      <w:numFmt w:val="decimal"/>
+      <w:lvlText w:val="%8."/>
+      <w:lvlJc w:val="left"/>
+      <w:pPr>
+        <w:tabs>
+          <w:tab w:val="num" w:pos="5760"/>
+        </w:tabs>
+        <w:ind w:left="5760" w:hanging="360"/>
+      </w:pPr>
+    </w:lvl>
+    <w:lvl w:ilvl="8" w:tentative="1">
+      <w:start w:val="1"/>
+      <w:numFmt w:val="decimal"/>
+      <w:lvlText w:val="%9."/>
+      <w:lvlJc w:val="left"/>
+      <w:pPr>
+        <w:tabs>
+          <w:tab w:val="num" w:pos="6480"/>
+        </w:tabs>
+        <w:ind w:left="6480" w:hanging="360"/>
+      </w:pPr>
+    </w:lvl>
+  </w:abstractNum>
+  <w:abstractNum w:abstractNumId="3" w15:restartNumberingAfterBreak="0">
+    <w:nsid w:val="706F2E0C"/>
+    <w:multiLevelType w:val="multilevel"/>
+    <w:tmpl w:val="6CE05C5C"/>
+    <w:lvl w:ilvl="0">
+      <w:start w:val="1"/>
+      <w:numFmt w:val="decimal"/>
+      <w:lvlText w:val="%1."/>
+      <w:lvlJc w:val="left"/>
+      <w:pPr>
+        <w:tabs>
+          <w:tab w:val="num" w:pos="720"/>
+        </w:tabs>
+        <w:ind w:left="720" w:hanging="360"/>
+      </w:pPr>
+    </w:lvl>
+    <w:lvl w:ilvl="1" w:tentative="1">
+      <w:start w:val="1"/>
+      <w:numFmt w:val="decimal"/>
+      <w:lvlText w:val="%2."/>
+      <w:lvlJc w:val="left"/>
+      <w:pPr>
+        <w:tabs>
+          <w:tab w:val="num" w:pos="1440"/>
+        </w:tabs>
+        <w:ind w:left="1440" w:hanging="360"/>
+      </w:pPr>
+    </w:lvl>
+    <w:lvl w:ilvl="2" w:tentative="1">
+      <w:start w:val="1"/>
+      <w:numFmt w:val="decimal"/>
+      <w:lvlText w:val="%3."/>
+      <w:lvlJc w:val="left"/>
+      <w:pPr>
+        <w:tabs>
+          <w:tab w:val="num" w:pos="2160"/>
+        </w:tabs>
+        <w:ind w:left="2160" w:hanging="360"/>
+      </w:pPr>
+    </w:lvl>
+    <w:lvl w:ilvl="3" w:tentative="1">
+      <w:start w:val="1"/>
+      <w:numFmt w:val="decimal"/>
+      <w:lvlText w:val="%4."/>
+      <w:lvlJc w:val="left"/>
+      <w:pPr>
+        <w:tabs>
+          <w:tab w:val="num" w:pos="2880"/>
+        </w:tabs>
+        <w:ind w:left="2880" w:hanging="360"/>
+      </w:pPr>
+    </w:lvl>
+    <w:lvl w:ilvl="4" w:tentative="1">
+      <w:start w:val="1"/>
+      <w:numFmt w:val="decimal"/>
+      <w:lvlText w:val="%5."/>
+      <w:lvlJc w:val="left"/>
+      <w:pPr>
+        <w:tabs>
+          <w:tab w:val="num" w:pos="3600"/>
+        </w:tabs>
+        <w:ind w:left="3600" w:hanging="360"/>
+      </w:pPr>
+    </w:lvl>
+    <w:lvl w:ilvl="5" w:tentative="1">
+      <w:start w:val="1"/>
+      <w:numFmt w:val="decimal"/>
+      <w:lvlText w:val="%6."/>
+      <w:lvlJc w:val="left"/>
+      <w:pPr>
+        <w:tabs>
+          <w:tab w:val="num" w:pos="4320"/>
+        </w:tabs>
+        <w:ind w:left="4320" w:hanging="360"/>
+      </w:pPr>
+    </w:lvl>
+    <w:lvl w:ilvl="6" w:tentative="1">
+      <w:start w:val="1"/>
+      <w:numFmt w:val="decimal"/>
+      <w:lvlText w:val="%7."/>
+      <w:lvlJc w:val="left"/>
+      <w:pPr>
+        <w:tabs>
+          <w:tab w:val="num" w:pos="5040"/>
+        </w:tabs>
+        <w:ind w:left="5040" w:hanging="360"/>
+      </w:pPr>
+    </w:lvl>
+    <w:lvl w:ilvl="7" w:tentative="1">
+      <w:start w:val="1"/>
+      <w:numFmt w:val="decimal"/>
+      <w:lvlText w:val="%8."/>
+      <w:lvlJc w:val="left"/>
+      <w:pPr>
+        <w:tabs>
+          <w:tab w:val="num" w:pos="5760"/>
+        </w:tabs>
+        <w:ind w:left="5760" w:hanging="360"/>
+      </w:pPr>
+    </w:lvl>
+    <w:lvl w:ilvl="8" w:tentative="1">
+      <w:start w:val="1"/>
+      <w:numFmt w:val="decimal"/>
+      <w:lvlText w:val="%9."/>
+      <w:lvlJc w:val="left"/>
+      <w:pPr>
+        <w:tabs>
+          <w:tab w:val="num" w:pos="6480"/>
+        </w:tabs>
+        <w:ind w:left="6480" w:hanging="360"/>
+      </w:pPr>
+    </w:lvl>
+  </w:abstractNum>
+  <w:num w:numId="1" w16cid:durableId="182865977">
+    <w:abstractNumId w:val="1"/>
+  </w:num>
+  <w:num w:numId="2" w16cid:durableId="1488470858">
+    <w:abstractNumId w:val="3"/>
+  </w:num>
+  <w:num w:numId="3" w16cid:durableId="450780862">
+    <w:abstractNumId w:val="0"/>
+  </w:num>
+  <w:num w:numId="4" w16cid:durableId="650334477">
+    <w:abstractNumId w:val="2"/>
+  </w:num>
+</w:numbering>
 </file>
 
 <file path=word/styles.xml><?xml version="1.0" encoding="utf-8"?>
@@ -847,7 +1789,6 @@
   <w:style w:type="character" w:default="1" w:styleId="Fuentedeprrafopredeter">
     <w:name w:val="Default Paragraph Font"/>
     <w:uiPriority w:val="1"/>
-    <w:semiHidden/>
     <w:unhideWhenUsed/>
   </w:style>
   <w:style w:type="table" w:default="1" w:styleId="Tablanormal">

</xml_diff>

<commit_message>
arreglos en los formularios y lista de actividades
</commit_message>
<xml_diff>
--- a/EL POLLO.docx
+++ b/EL POLLO.docx
@@ -3,140 +3,625 @@
 <w:document xmlns:wpc="http://schemas.microsoft.com/office/word/2010/wordprocessingCanvas" xmlns:cx="http://schemas.microsoft.com/office/drawing/2014/chartex" xmlns:cx1="http://schemas.microsoft.com/office/drawing/2015/9/8/chartex" xmlns:cx2="http://schemas.microsoft.com/office/drawing/2015/10/21/chartex" xmlns:cx3="http://schemas.microsoft.com/office/drawing/2016/5/9/chartex" xmlns:cx4="http://schemas.microsoft.com/office/drawing/2016/5/10/chartex" xmlns:cx5="http://schemas.microsoft.com/office/drawing/2016/5/11/chartex" xmlns:cx6="http://schemas.microsoft.com/office/drawing/2016/5/12/chartex" xmlns:cx7="http://schemas.microsoft.com/office/drawing/2016/5/13/chartex" xmlns:cx8="http://schemas.microsoft.com/office/drawing/2016/5/14/chartex" xmlns:mc="http://schemas.openxmlformats.org/markup-compatibility/2006" xmlns:aink="http://schemas.microsoft.com/office/drawing/2016/ink" xmlns:am3d="http://schemas.microsoft.com/office/drawing/2017/model3d" xmlns:o="urn:schemas-microsoft-com:office:office" xmlns:oel="http://schemas.microsoft.com/office/2019/extlst" xmlns:r="http://schemas.openxmlformats.org/officeDocument/2006/relationships" xmlns:m="http://schemas.openxmlformats.org/officeDocument/2006/math" xmlns:v="urn:schemas-microsoft-com:vml" xmlns:wp14="http://schemas.microsoft.com/office/word/2010/wordprocessingDrawing" xmlns:wp="http://schemas.openxmlformats.org/drawingml/2006/wordprocessingDrawing" xmlns:w10="urn:schemas-microsoft-com:office:word" xmlns:w="http://schemas.openxmlformats.org/wordprocessingml/2006/main" xmlns:w14="http://schemas.microsoft.com/office/word/2010/wordml" xmlns:w15="http://schemas.microsoft.com/office/word/2012/wordml" xmlns:w16cex="http://schemas.microsoft.com/office/word/2018/wordml/cex" xmlns:w16cid="http://schemas.microsoft.com/office/word/2016/wordml/cid" xmlns:w16="http://schemas.microsoft.com/office/word/2018/wordml" xmlns:w16du="http://schemas.microsoft.com/office/word/2023/wordml/word16du" xmlns:w16sdtdh="http://schemas.microsoft.com/office/word/2020/wordml/sdtdatahash" xmlns:w16sdtfl="http://schemas.microsoft.com/office/word/2024/wordml/sdtformatlock" xmlns:w16se="http://schemas.microsoft.com/office/word/2015/wordml/symex" xmlns:wpg="http://schemas.microsoft.com/office/word/2010/wordprocessingGroup" xmlns:wpi="http://schemas.microsoft.com/office/word/2010/wordprocessingInk" xmlns:wne="http://schemas.microsoft.com/office/word/2006/wordml" xmlns:wps="http://schemas.microsoft.com/office/word/2010/wordprocessingShape" mc:Ignorable="w14 w15 w16se w16cid w16 w16cex w16sdtdh w16sdtfl w16du wp14">
   <w:body>
     <w:p>
-      <w:r>
-        <w:t>SALE TODO EL POLLO</w:t>
-      </w:r>
-    </w:p>
-    <w:p>
-      <w:r>
-        <w:t>RECOGER TODO EL EQUIPO. ( BEBEDEROS Y COMEDEROS)</w:t>
+      <w:pPr>
+        <w:rPr>
+          <w:b/>
+          <w:bCs/>
+        </w:rPr>
+      </w:pPr>
+      <w:r>
+        <w:rPr>
+          <w:b/>
+          <w:bCs/>
+        </w:rPr>
+        <w:t>ALISTAMIENTO</w:t>
+      </w:r>
+    </w:p>
+    <w:p>
+      <w:r>
+        <w:rPr>
+          <w:b/>
+          <w:bCs/>
+        </w:rPr>
+        <w:t>Retiro5</w:t>
+      </w:r>
+    </w:p>
+    <w:p>
+      <w:pPr>
+        <w:numPr>
+          <w:ilvl w:val="0"/>
+          <w:numId w:val="1"/>
+        </w:numPr>
+      </w:pPr>
+      <w:r>
+        <w:t>Recoger Equipo</w:t>
+      </w:r>
+      <w:r>
+        <w:t xml:space="preserve">. </w:t>
+      </w:r>
+      <w:r>
+        <w:t xml:space="preserve"> </w:t>
+      </w:r>
+      <w:r>
+        <w:rPr>
+          <w:highlight w:val="yellow"/>
+        </w:rPr>
+        <w:t>( BEBEDEROS Y COMEDEROS)</w:t>
+      </w:r>
+    </w:p>
+    <w:p>
+      <w:pPr>
+        <w:numPr>
+          <w:ilvl w:val="0"/>
+          <w:numId w:val="1"/>
+        </w:numPr>
+        <w:rPr>
+          <w:highlight w:val="yellow"/>
+        </w:rPr>
+      </w:pPr>
+      <w:r>
+        <w:rPr>
+          <w:highlight w:val="yellow"/>
+        </w:rPr>
+        <w:t>Lavar Equipo (Bebederos / Comederos)</w:t>
+      </w:r>
+    </w:p>
+    <w:p>
+      <w:pPr>
+        <w:numPr>
+          <w:ilvl w:val="0"/>
+          <w:numId w:val="1"/>
+        </w:numPr>
+      </w:pPr>
+      <w:r>
+        <w:t>Barrer Pluma</w:t>
+      </w:r>
+    </w:p>
+    <w:p>
+      <w:pPr>
+        <w:numPr>
+          <w:ilvl w:val="0"/>
+          <w:numId w:val="1"/>
+        </w:numPr>
+      </w:pPr>
+      <w:r>
+        <w:t>Sacar Caracha</w:t>
+      </w:r>
+    </w:p>
+    <w:p>
+      <w:pPr>
+        <w:numPr>
+          <w:ilvl w:val="0"/>
+          <w:numId w:val="1"/>
+        </w:numPr>
+      </w:pPr>
+      <w:r>
+        <w:t>Amontonar pollinaza 8 dias y registrar temperatura interna</w:t>
+      </w:r>
+    </w:p>
+    <w:p>
+      <w:pPr>
+        <w:numPr>
+          <w:ilvl w:val="0"/>
+          <w:numId w:val="1"/>
+        </w:numPr>
+      </w:pPr>
+      <w:r>
+        <w:t>Retiro de Pollinaza Reusada en Exceso</w:t>
+      </w:r>
+    </w:p>
+    <w:p>
+      <w:r>
+        <w:rPr>
+          <w:b/>
+          <w:bCs/>
+        </w:rPr>
+        <w:t>Desinfeccion</w:t>
+      </w:r>
+      <w:r>
+        <w:rPr>
+          <w:b/>
+          <w:bCs/>
+        </w:rPr>
+        <w:t xml:space="preserve"> 8 </w:t>
+      </w:r>
+    </w:p>
+    <w:p>
+      <w:pPr>
+        <w:numPr>
+          <w:ilvl w:val="0"/>
+          <w:numId w:val="2"/>
+        </w:numPr>
+      </w:pPr>
+      <w:r>
+        <w:t>Fumiga Coquito 1</w:t>
+      </w:r>
+    </w:p>
+    <w:p>
+      <w:pPr>
+        <w:numPr>
+          <w:ilvl w:val="0"/>
+          <w:numId w:val="2"/>
+        </w:numPr>
+      </w:pPr>
+      <w:r>
+        <w:t>Fumiga Coquito 2</w:t>
+      </w:r>
+    </w:p>
+    <w:p>
+      <w:pPr>
+        <w:numPr>
+          <w:ilvl w:val="0"/>
+          <w:numId w:val="2"/>
+        </w:numPr>
+      </w:pPr>
+      <w:r>
+        <w:t>Barrer / Lavado Galpon</w:t>
+      </w:r>
+    </w:p>
+    <w:p>
+      <w:pPr>
+        <w:numPr>
+          <w:ilvl w:val="0"/>
+          <w:numId w:val="2"/>
+        </w:numPr>
+      </w:pPr>
+      <w:r>
+        <w:t>Barrer malla y limpiar techo</w:t>
+      </w:r>
+    </w:p>
+    <w:p>
+      <w:pPr>
+        <w:numPr>
+          <w:ilvl w:val="0"/>
+          <w:numId w:val="2"/>
+        </w:numPr>
+      </w:pPr>
+      <w:r>
+        <w:t>Reparaciones locativas</w:t>
+      </w:r>
+    </w:p>
+    <w:p>
+      <w:pPr>
+        <w:numPr>
+          <w:ilvl w:val="0"/>
+          <w:numId w:val="2"/>
+        </w:numPr>
+      </w:pPr>
+      <w:r>
+        <w:t>Lavar tanques de agua y purgar lineas</w:t>
+      </w:r>
+    </w:p>
+    <w:p>
+      <w:pPr>
+        <w:numPr>
+          <w:ilvl w:val="0"/>
+          <w:numId w:val="2"/>
+        </w:numPr>
+      </w:pPr>
+      <w:r>
+        <w:t>Calear</w:t>
+      </w:r>
+    </w:p>
+    <w:p>
+      <w:pPr>
+        <w:numPr>
+          <w:ilvl w:val="0"/>
+          <w:numId w:val="2"/>
+        </w:numPr>
+      </w:pPr>
+      <w:r>
+        <w:t>Fumiga Desinfectante</w:t>
+      </w:r>
+    </w:p>
+    <w:p>
+      <w:r>
+        <w:rPr>
+          <w:b/>
+          <w:bCs/>
+        </w:rPr>
+        <w:t>Instalacion5</w:t>
+      </w:r>
+    </w:p>
+    <w:p>
+      <w:pPr>
+        <w:numPr>
+          <w:ilvl w:val="0"/>
+          <w:numId w:val="3"/>
+        </w:numPr>
+      </w:pPr>
+      <w:r>
+        <w:t>Cisco Nuevo (en la mitad sin cama usada)</w:t>
+      </w:r>
+    </w:p>
+    <w:p>
+      <w:pPr>
+        <w:numPr>
+          <w:ilvl w:val="0"/>
+          <w:numId w:val="3"/>
+        </w:numPr>
+      </w:pPr>
+      <w:r>
+        <w:t>Divisiones</w:t>
+      </w:r>
+    </w:p>
+    <w:p>
+      <w:pPr>
+        <w:numPr>
+          <w:ilvl w:val="0"/>
+          <w:numId w:val="3"/>
+        </w:numPr>
+      </w:pPr>
+      <w:r>
+        <w:t>Instalar Calentadoras</w:t>
+      </w:r>
+    </w:p>
+    <w:p>
+      <w:pPr>
+        <w:numPr>
+          <w:ilvl w:val="0"/>
+          <w:numId w:val="3"/>
+        </w:numPr>
+      </w:pPr>
+      <w:r>
+        <w:t>Meter Bebederos de Volteo y Comederos Babies</w:t>
+      </w:r>
+    </w:p>
+    <w:p>
+      <w:pPr>
+        <w:numPr>
+          <w:ilvl w:val="0"/>
+          <w:numId w:val="3"/>
+        </w:numPr>
+        <w:rPr>
+          <w:highlight w:val="yellow"/>
+        </w:rPr>
+      </w:pPr>
+      <w:r>
+        <w:rPr>
+          <w:highlight w:val="yellow"/>
+        </w:rPr>
+        <w:t>Encortinar</w:t>
+      </w:r>
+    </w:p>
+    <w:p>
+      <w:pPr>
+        <w:ind w:left="720"/>
+      </w:pPr>
+    </w:p>
+    <w:p>
+      <w:r>
+        <w:rPr>
+          <w:b/>
+          <w:bCs/>
+        </w:rPr>
+        <w:t>Recibimiento5</w:t>
+      </w:r>
+    </w:p>
+    <w:p>
+      <w:pPr>
+        <w:numPr>
+          <w:ilvl w:val="0"/>
+          <w:numId w:val="4"/>
+        </w:numPr>
+      </w:pPr>
+      <w:r>
+        <w:t>Precalentar 8h antes de la llegada</w:t>
+      </w:r>
+      <w:r>
+        <w:t xml:space="preserve"> </w:t>
+      </w:r>
+      <w:r>
+        <w:rPr>
+          <w:highlight w:val="yellow"/>
+        </w:rPr>
+        <w:t>(32 GRADOS)</w:t>
+      </w:r>
+    </w:p>
+    <w:p>
+      <w:pPr>
+        <w:numPr>
+          <w:ilvl w:val="0"/>
+          <w:numId w:val="4"/>
+        </w:numPr>
+      </w:pPr>
+      <w:r>
+        <w:t>Purgar Lineas</w:t>
+      </w:r>
+    </w:p>
+    <w:p>
+      <w:pPr>
+        <w:numPr>
+          <w:ilvl w:val="0"/>
+          <w:numId w:val="4"/>
+        </w:numPr>
+      </w:pPr>
+      <w:r>
+        <w:t>Neutrar el Agua de Bebida</w:t>
+      </w:r>
+    </w:p>
+    <w:p>
+      <w:pPr>
+        <w:numPr>
+          <w:ilvl w:val="0"/>
+          <w:numId w:val="4"/>
+        </w:numPr>
+      </w:pPr>
+      <w:r>
+        <w:t>Verificar Temperatura</w:t>
+      </w:r>
+    </w:p>
+    <w:p>
+      <w:pPr>
+        <w:numPr>
+          <w:ilvl w:val="0"/>
+          <w:numId w:val="4"/>
+        </w:numPr>
+      </w:pPr>
+      <w:r>
+        <w:lastRenderedPageBreak/>
+        <w:t>Llegada del Pollito</w:t>
+      </w:r>
+    </w:p>
+    <w:p>
+      <w:pPr>
+        <w:rPr>
+          <w:b/>
+          <w:bCs/>
+        </w:rPr>
+      </w:pPr>
+      <w:r>
+        <w:rPr>
+          <w:b/>
+          <w:bCs/>
+        </w:rPr>
+        <w:t>ACTIVIDADES DEL LOTE</w:t>
+      </w:r>
+    </w:p>
+    <w:p/>
+    <w:p>
+      <w:r>
+        <w:rPr>
+          <w:b/>
+          <w:bCs/>
+        </w:rPr>
+        <w:t>DIA 3</w:t>
+      </w:r>
+      <w:r>
+        <w:t xml:space="preserve"> </w:t>
+      </w:r>
+      <w:r>
+        <w:t xml:space="preserve">AMPLIACION </w:t>
+      </w:r>
+    </w:p>
+    <w:p>
+      <w:r>
+        <w:rPr>
+          <w:b/>
+          <w:bCs/>
+        </w:rPr>
+        <w:t>DIA 8</w:t>
+      </w:r>
+      <w:r>
+        <w:t xml:space="preserve"> </w:t>
+      </w:r>
+      <w:r>
+        <w:t xml:space="preserve">AMPLIACION </w:t>
+      </w:r>
+    </w:p>
+    <w:p>
+      <w:r>
+        <w:rPr>
+          <w:b/>
+          <w:bCs/>
+        </w:rPr>
+        <w:t>DIA 9</w:t>
+      </w:r>
+      <w:r>
+        <w:t xml:space="preserve"> </w:t>
+      </w:r>
+      <w:r>
+        <w:t xml:space="preserve">VACUNANCION </w:t>
+      </w:r>
+      <w:r>
+        <w:t>NEWCASTLE</w:t>
+      </w:r>
+      <w:r>
+        <w:t xml:space="preserve"> (10)</w:t>
+      </w:r>
+      <w:r>
+        <w:t xml:space="preserve"> /</w:t>
+      </w:r>
+      <w:r>
+        <w:t xml:space="preserve"> Y GUMBORO </w:t>
+      </w:r>
+      <w:r>
+        <w:t>(8)</w:t>
+      </w:r>
+    </w:p>
+    <w:p>
+      <w:r>
+        <w:rPr>
+          <w:b/>
+          <w:bCs/>
+        </w:rPr>
+        <w:t>DIA 11</w:t>
+      </w:r>
+      <w:r>
+        <w:t xml:space="preserve"> </w:t>
+      </w:r>
+      <w:r>
+        <w:t xml:space="preserve">SACAR BEBEDEROS BABIES </w:t>
+      </w:r>
+    </w:p>
+    <w:p>
+      <w:r>
+        <w:rPr>
+          <w:b/>
+          <w:bCs/>
+        </w:rPr>
+        <w:t>DIA 15</w:t>
+      </w:r>
+      <w:r>
+        <w:t xml:space="preserve"> AMPLIACION Y</w:t>
+      </w:r>
+      <w:r>
+        <w:t xml:space="preserve"> RETIRADA CALENTADORAS </w:t>
+      </w:r>
+    </w:p>
+    <w:p>
+      <w:r>
+        <w:rPr>
+          <w:b/>
+          <w:bCs/>
+        </w:rPr>
+        <w:t>DIA 20</w:t>
+      </w:r>
+      <w:r>
+        <w:t xml:space="preserve"> </w:t>
+      </w:r>
+      <w:r>
+        <w:t xml:space="preserve">AMPLIACION </w:t>
+      </w:r>
+    </w:p>
+    <w:p>
+      <w:r>
+        <w:rPr>
+          <w:b/>
+          <w:bCs/>
+        </w:rPr>
+        <w:t>DIA 20</w:t>
+      </w:r>
+      <w:r>
+        <w:t xml:space="preserve"> </w:t>
+      </w:r>
+      <w:r>
+        <w:t xml:space="preserve">DESENCORTINA </w:t>
+      </w:r>
+    </w:p>
+    <w:p>
+      <w:r>
+        <w:rPr>
+          <w:b/>
+          <w:bCs/>
+        </w:rPr>
+        <w:t>DIA 2</w:t>
+      </w:r>
+      <w:r>
+        <w:rPr>
+          <w:b/>
+          <w:bCs/>
+        </w:rPr>
+        <w:t>1</w:t>
+      </w:r>
+      <w:r>
+        <w:t xml:space="preserve"> </w:t>
+      </w:r>
+      <w:r>
+        <w:t xml:space="preserve">BAJAR HEMBRAS </w:t>
+      </w:r>
+    </w:p>
+    <w:p/>
+    <w:p/>
+    <w:p>
+      <w:pPr>
+        <w:rPr>
+          <w:b/>
+          <w:bCs/>
+          <w:sz w:val="24"/>
+          <w:szCs w:val="24"/>
+        </w:rPr>
+      </w:pPr>
+      <w:r>
+        <w:rPr>
+          <w:b/>
+          <w:bCs/>
+          <w:sz w:val="24"/>
+          <w:szCs w:val="24"/>
+        </w:rPr>
+        <w:t>RUTINA</w:t>
+      </w:r>
+      <w:r>
+        <w:rPr>
+          <w:b/>
+          <w:bCs/>
+          <w:sz w:val="24"/>
+          <w:szCs w:val="24"/>
+        </w:rPr>
+        <w:t xml:space="preserve"> - </w:t>
+      </w:r>
+      <w:r>
+        <w:rPr>
+          <w:b/>
+          <w:bCs/>
+          <w:sz w:val="24"/>
+          <w:szCs w:val="24"/>
+        </w:rPr>
+        <w:t>DIARIO</w:t>
+      </w:r>
+    </w:p>
+    <w:p>
+      <w:r>
+        <w:rPr>
+          <w:b/>
+          <w:bCs/>
+        </w:rPr>
+        <w:t>AGUA</w:t>
+      </w:r>
+      <w:r>
+        <w:t xml:space="preserve">: </w:t>
+      </w:r>
+      <w:r>
+        <w:t>CLORAR TANQUE PRINCIPAL (CADA 3 DIAS) 24H ANTES SE SULFATA</w:t>
+      </w:r>
+    </w:p>
+    <w:p>
+      <w:r>
+        <w:t>MEDIR EL</w:t>
+      </w:r>
+      <w:r>
+        <w:t xml:space="preserve"> CLORO Y PH  EN LAS LINEAS, TANQUES </w:t>
+      </w:r>
+    </w:p>
+    <w:p>
+      <w:r>
+        <w:t>PURGAR LINEA</w:t>
+      </w:r>
+    </w:p>
+    <w:p/>
+    <w:p>
+      <w:r>
+        <w:rPr>
+          <w:b/>
+          <w:bCs/>
+        </w:rPr>
+        <w:t>COMIDA</w:t>
       </w:r>
       <w:r>
         <w:br/>
-        <w:t>LAVA EL EQUIPO</w:t>
+        <w:t>5-5:30 AM       70%</w:t>
+      </w:r>
+    </w:p>
+    <w:p>
+      <w:r>
+        <w:t>3-4 PM       30%</w:t>
       </w:r>
     </w:p>
     <w:p/>
     <w:p>
       <w:r>
-        <w:t>BARRE LA PLUMA</w:t>
-      </w:r>
-    </w:p>
-    <w:p>
-      <w:r>
-        <w:t>SACAR LA CARACHA</w:t>
-      </w:r>
-    </w:p>
-    <w:p>
-      <w:r>
-        <w:t>AMONTONA  ( 8 DIAS)</w:t>
-      </w:r>
-    </w:p>
-    <w:p/>
-    <w:p>
-      <w:r>
-        <w:t>FUMIGA PARA EL COQUITO</w:t>
-      </w:r>
-    </w:p>
-    <w:p>
-      <w:r>
-        <w:t>BARRE</w:t>
-      </w:r>
-    </w:p>
-    <w:p>
-      <w:r>
-        <w:t>CALEA</w:t>
-      </w:r>
-    </w:p>
-    <w:p/>
-    <w:p>
-      <w:r>
-        <w:t>CISCO NUEVO</w:t>
-      </w:r>
-      <w:r>
-        <w:br/>
-        <w:t xml:space="preserve">DIVISIONES </w:t>
-      </w:r>
-    </w:p>
-    <w:p>
-      <w:r>
-        <w:t>INSTALAR CALENTADORAS</w:t>
-      </w:r>
-    </w:p>
-    <w:p>
-      <w:r>
-        <w:t>SE METE EL EQUIPO (BEBEDEROS DE VOLTEO  Y COMEDEROS BABIES)</w:t>
-      </w:r>
-    </w:p>
-    <w:p>
-      <w:r>
-        <w:t>ENCORTINA</w:t>
-      </w:r>
-      <w:r>
-        <w:br/>
-      </w:r>
-      <w:r>
-        <w:br/>
-        <w:t>---------</w:t>
-      </w:r>
-    </w:p>
-    <w:p>
-      <w:r>
-        <w:t>PRECALENTAR 8H ANTES (32 GRADOS)</w:t>
-      </w:r>
-      <w:r>
-        <w:br/>
-        <w:t>LLEGA EL POLLO</w:t>
-      </w:r>
-    </w:p>
-    <w:p/>
-    <w:p>
-      <w:r>
-        <w:t>AMPLIACION (DIA 3)</w:t>
-      </w:r>
-    </w:p>
-    <w:p/>
-    <w:p>
-      <w:r>
-        <w:t>AMPLIACION (DIA 8)</w:t>
-      </w:r>
-    </w:p>
-    <w:p>
-      <w:r>
-        <w:t>VACUNANCION NEWCASTLE  / Y GUMBORO (DIA 9)</w:t>
-      </w:r>
-    </w:p>
-    <w:p>
-      <w:r>
-        <w:t>SACAR BEBEDEROS BABIES (DIA 11)</w:t>
-      </w:r>
-    </w:p>
-    <w:p>
-      <w:r>
-        <w:t xml:space="preserve">AMPLIACION </w:t>
-      </w:r>
-      <w:r>
-        <w:t xml:space="preserve"> Y RETIRADA CALENTADORAS </w:t>
-      </w:r>
-      <w:r>
-        <w:t>(DIA 15)</w:t>
-      </w:r>
-    </w:p>
-    <w:p/>
-    <w:p>
-      <w:r>
-        <w:t>AMPLIACION (DIA 20)</w:t>
-      </w:r>
-    </w:p>
-    <w:p>
-      <w:r>
-        <w:t>DESENCORTINA (DIA 20)</w:t>
-      </w:r>
-    </w:p>
-    <w:p>
-      <w:r>
-        <w:lastRenderedPageBreak/>
+        <w:rPr>
+          <w:b/>
+          <w:bCs/>
+        </w:rPr>
         <w:t>FUMIGACION</w:t>
+      </w:r>
+      <w:r>
+        <w:rPr>
+          <w:b/>
+          <w:bCs/>
+        </w:rPr>
+        <w:t xml:space="preserve"> 4pm</w:t>
       </w:r>
       <w:r>
         <w:br/>
@@ -145,95 +630,83 @@
       <w:r>
         <w:t>. 9AM.  4M</w:t>
       </w:r>
-      <w:r>
-        <w:br/>
-      </w:r>
-      <w:r>
-        <w:br/>
-        <w:t>CIPERMETRINA (DIARIO) (PARA LA MOSCA) ALREDEDOR DEL GALPON</w:t>
-      </w:r>
-      <w:r>
-        <w:t>.  5PM</w:t>
+    </w:p>
+    <w:p>
+      <w:r>
+        <w:t>*NOVABRONCOL O VIRCONX ( CASOS ESPECIALES)</w:t>
       </w:r>
     </w:p>
     <w:p/>
     <w:p>
       <w:r>
-        <w:t>*</w:t>
-      </w:r>
-      <w:r>
-        <w:t>NOVABRONCOL O VIRCONX ( CASOS ESPECIALES)</w:t>
+        <w:t>REVOLCAR CAMA (DIARIO)</w:t>
       </w:r>
     </w:p>
     <w:p/>
-    <w:p/>
-    <w:p>
-      <w:r>
-        <w:t>COMIDA</w:t>
-      </w:r>
-      <w:r>
-        <w:br/>
-        <w:t>5-5:30 AM       70%</w:t>
-      </w:r>
-    </w:p>
-    <w:p/>
-    <w:p>
-      <w:r>
-        <w:t>3-4 PM       30%</w:t>
-      </w:r>
-    </w:p>
-    <w:p/>
-    <w:p/>
-    <w:p>
-      <w:r>
-        <w:t>AGUA</w:t>
-      </w:r>
-    </w:p>
-    <w:p/>
-    <w:p>
-      <w:r>
-        <w:t>CLORAR TANQUE PRINCIPAL (CADA 3 DIAS) 24H ANTES SE SULFATA</w:t>
-      </w:r>
-    </w:p>
-    <w:p/>
-    <w:p>
-      <w:r>
-        <w:t>SE MIDE EL CLORO Y PH  EN LAS LINEAS, TANQUES ( DIARIO)</w:t>
-      </w:r>
-    </w:p>
-    <w:p/>
-    <w:p>
-      <w:r>
+    <w:p>
+      <w:r>
+        <w:rPr>
+          <w:b/>
+          <w:bCs/>
+        </w:rPr>
         <w:t>CONTROL DE PEDILUBIOS</w:t>
       </w:r>
       <w:r>
         <w:br/>
         <w:t>CREOLINA (DIARIO O 2 DIAS)</w:t>
       </w:r>
+    </w:p>
+    <w:p>
+      <w:r>
+        <w:rPr>
+          <w:b/>
+          <w:bCs/>
+          <w:sz w:val="24"/>
+          <w:szCs w:val="24"/>
+        </w:rPr>
+        <w:lastRenderedPageBreak/>
+        <w:t>RUTINA</w:t>
+      </w:r>
+      <w:r>
+        <w:rPr>
+          <w:b/>
+          <w:bCs/>
+          <w:sz w:val="24"/>
+          <w:szCs w:val="24"/>
+        </w:rPr>
+        <w:t xml:space="preserve"> - SEMANAL</w:t>
+      </w:r>
+    </w:p>
+    <w:p>
       <w:r>
         <w:br/>
       </w:r>
       <w:r>
         <w:br/>
+      </w:r>
+      <w:r>
+        <w:rPr>
+          <w:b/>
+          <w:bCs/>
+        </w:rPr>
         <w:t>CONTROL ROEDORES</w:t>
       </w:r>
       <w:r>
         <w:br/>
-        <w:t>CICARIO (DIARIO)</w:t>
+        <w:t xml:space="preserve">CICARIO </w:t>
+      </w:r>
+    </w:p>
+    <w:p>
+      <w:r>
+        <w:t>LAVAR FILTROS</w:t>
+      </w:r>
+    </w:p>
+    <w:p>
+      <w:r>
+        <w:t>CIPERMETRINA (DIARIO) (PARA LA MOSCA) ALREDEDOR DEL GALPON.  5PM</w:t>
       </w:r>
     </w:p>
     <w:p/>
-    <w:p>
-      <w:r>
-        <w:t>REVOLCAR CAMA (DIARIO)</w:t>
-      </w:r>
-    </w:p>
-    <w:p/>
-    <w:p>
-      <w:r>
-        <w:t>LAVAR FILTROS</w:t>
-      </w:r>
-    </w:p>
     <w:sectPr>
       <w:pgSz w:w="12240" w:h="15840"/>
       <w:pgMar w:top="1417" w:right="1701" w:bottom="1417" w:left="1701" w:header="708" w:footer="708" w:gutter="0"/>
@@ -242,6 +715,475 @@
     </w:sectPr>
   </w:body>
 </w:document>
+</file>
+
+<file path=word/numbering.xml><?xml version="1.0" encoding="utf-8"?>
+<w:numbering xmlns:wpc="http://schemas.microsoft.com/office/word/2010/wordprocessingCanvas" xmlns:cx="http://schemas.microsoft.com/office/drawing/2014/chartex" xmlns:cx1="http://schemas.microsoft.com/office/drawing/2015/9/8/chartex" xmlns:cx2="http://schemas.microsoft.com/office/drawing/2015/10/21/chartex" xmlns:cx3="http://schemas.microsoft.com/office/drawing/2016/5/9/chartex" xmlns:cx4="http://schemas.microsoft.com/office/drawing/2016/5/10/chartex" xmlns:cx5="http://schemas.microsoft.com/office/drawing/2016/5/11/chartex" xmlns:cx6="http://schemas.microsoft.com/office/drawing/2016/5/12/chartex" xmlns:cx7="http://schemas.microsoft.com/office/drawing/2016/5/13/chartex" xmlns:cx8="http://schemas.microsoft.com/office/drawing/2016/5/14/chartex" xmlns:mc="http://schemas.openxmlformats.org/markup-compatibility/2006" xmlns:aink="http://schemas.microsoft.com/office/drawing/2016/ink" xmlns:am3d="http://schemas.microsoft.com/office/drawing/2017/model3d" xmlns:o="urn:schemas-microsoft-com:office:office" xmlns:oel="http://schemas.microsoft.com/office/2019/extlst" xmlns:r="http://schemas.openxmlformats.org/officeDocument/2006/relationships" xmlns:m="http://schemas.openxmlformats.org/officeDocument/2006/math" xmlns:v="urn:schemas-microsoft-com:vml" xmlns:wp14="http://schemas.microsoft.com/office/word/2010/wordprocessingDrawing" xmlns:wp="http://schemas.openxmlformats.org/drawingml/2006/wordprocessingDrawing" xmlns:w10="urn:schemas-microsoft-com:office:word" xmlns:w="http://schemas.openxmlformats.org/wordprocessingml/2006/main" xmlns:w14="http://schemas.microsoft.com/office/word/2010/wordml" xmlns:w15="http://schemas.microsoft.com/office/word/2012/wordml" xmlns:w16cex="http://schemas.microsoft.com/office/word/2018/wordml/cex" xmlns:w16cid="http://schemas.microsoft.com/office/word/2016/wordml/cid" xmlns:w16="http://schemas.microsoft.com/office/word/2018/wordml" xmlns:w16du="http://schemas.microsoft.com/office/word/2023/wordml/word16du" xmlns:w16sdtdh="http://schemas.microsoft.com/office/word/2020/wordml/sdtdatahash" xmlns:w16sdtfl="http://schemas.microsoft.com/office/word/2024/wordml/sdtformatlock" xmlns:w16se="http://schemas.microsoft.com/office/word/2015/wordml/symex" xmlns:wpg="http://schemas.microsoft.com/office/word/2010/wordprocessingGroup" xmlns:wpi="http://schemas.microsoft.com/office/word/2010/wordprocessingInk" xmlns:wne="http://schemas.microsoft.com/office/word/2006/wordml" xmlns:wps="http://schemas.microsoft.com/office/word/2010/wordprocessingShape" mc:Ignorable="w14 w15 w16se w16cid w16 w16cex w16sdtdh w16sdtfl w16du wp14">
+  <w:abstractNum w:abstractNumId="0" w15:restartNumberingAfterBreak="0">
+    <w:nsid w:val="29DA570D"/>
+    <w:multiLevelType w:val="multilevel"/>
+    <w:tmpl w:val="98D84534"/>
+    <w:lvl w:ilvl="0">
+      <w:start w:val="1"/>
+      <w:numFmt w:val="decimal"/>
+      <w:lvlText w:val="%1."/>
+      <w:lvlJc w:val="left"/>
+      <w:pPr>
+        <w:tabs>
+          <w:tab w:val="num" w:pos="720"/>
+        </w:tabs>
+        <w:ind w:left="720" w:hanging="360"/>
+      </w:pPr>
+    </w:lvl>
+    <w:lvl w:ilvl="1" w:tentative="1">
+      <w:start w:val="1"/>
+      <w:numFmt w:val="decimal"/>
+      <w:lvlText w:val="%2."/>
+      <w:lvlJc w:val="left"/>
+      <w:pPr>
+        <w:tabs>
+          <w:tab w:val="num" w:pos="1440"/>
+        </w:tabs>
+        <w:ind w:left="1440" w:hanging="360"/>
+      </w:pPr>
+    </w:lvl>
+    <w:lvl w:ilvl="2" w:tentative="1">
+      <w:start w:val="1"/>
+      <w:numFmt w:val="decimal"/>
+      <w:lvlText w:val="%3."/>
+      <w:lvlJc w:val="left"/>
+      <w:pPr>
+        <w:tabs>
+          <w:tab w:val="num" w:pos="2160"/>
+        </w:tabs>
+        <w:ind w:left="2160" w:hanging="360"/>
+      </w:pPr>
+    </w:lvl>
+    <w:lvl w:ilvl="3" w:tentative="1">
+      <w:start w:val="1"/>
+      <w:numFmt w:val="decimal"/>
+      <w:lvlText w:val="%4."/>
+      <w:lvlJc w:val="left"/>
+      <w:pPr>
+        <w:tabs>
+          <w:tab w:val="num" w:pos="2880"/>
+        </w:tabs>
+        <w:ind w:left="2880" w:hanging="360"/>
+      </w:pPr>
+    </w:lvl>
+    <w:lvl w:ilvl="4" w:tentative="1">
+      <w:start w:val="1"/>
+      <w:numFmt w:val="decimal"/>
+      <w:lvlText w:val="%5."/>
+      <w:lvlJc w:val="left"/>
+      <w:pPr>
+        <w:tabs>
+          <w:tab w:val="num" w:pos="3600"/>
+        </w:tabs>
+        <w:ind w:left="3600" w:hanging="360"/>
+      </w:pPr>
+    </w:lvl>
+    <w:lvl w:ilvl="5" w:tentative="1">
+      <w:start w:val="1"/>
+      <w:numFmt w:val="decimal"/>
+      <w:lvlText w:val="%6."/>
+      <w:lvlJc w:val="left"/>
+      <w:pPr>
+        <w:tabs>
+          <w:tab w:val="num" w:pos="4320"/>
+        </w:tabs>
+        <w:ind w:left="4320" w:hanging="360"/>
+      </w:pPr>
+    </w:lvl>
+    <w:lvl w:ilvl="6" w:tentative="1">
+      <w:start w:val="1"/>
+      <w:numFmt w:val="decimal"/>
+      <w:lvlText w:val="%7."/>
+      <w:lvlJc w:val="left"/>
+      <w:pPr>
+        <w:tabs>
+          <w:tab w:val="num" w:pos="5040"/>
+        </w:tabs>
+        <w:ind w:left="5040" w:hanging="360"/>
+      </w:pPr>
+    </w:lvl>
+    <w:lvl w:ilvl="7" w:tentative="1">
+      <w:start w:val="1"/>
+      <w:numFmt w:val="decimal"/>
+      <w:lvlText w:val="%8."/>
+      <w:lvlJc w:val="left"/>
+      <w:pPr>
+        <w:tabs>
+          <w:tab w:val="num" w:pos="5760"/>
+        </w:tabs>
+        <w:ind w:left="5760" w:hanging="360"/>
+      </w:pPr>
+    </w:lvl>
+    <w:lvl w:ilvl="8" w:tentative="1">
+      <w:start w:val="1"/>
+      <w:numFmt w:val="decimal"/>
+      <w:lvlText w:val="%9."/>
+      <w:lvlJc w:val="left"/>
+      <w:pPr>
+        <w:tabs>
+          <w:tab w:val="num" w:pos="6480"/>
+        </w:tabs>
+        <w:ind w:left="6480" w:hanging="360"/>
+      </w:pPr>
+    </w:lvl>
+  </w:abstractNum>
+  <w:abstractNum w:abstractNumId="1" w15:restartNumberingAfterBreak="0">
+    <w:nsid w:val="4B5D6946"/>
+    <w:multiLevelType w:val="multilevel"/>
+    <w:tmpl w:val="FF0AEECE"/>
+    <w:lvl w:ilvl="0">
+      <w:start w:val="1"/>
+      <w:numFmt w:val="decimal"/>
+      <w:lvlText w:val="%1."/>
+      <w:lvlJc w:val="left"/>
+      <w:pPr>
+        <w:tabs>
+          <w:tab w:val="num" w:pos="720"/>
+        </w:tabs>
+        <w:ind w:left="720" w:hanging="360"/>
+      </w:pPr>
+    </w:lvl>
+    <w:lvl w:ilvl="1" w:tentative="1">
+      <w:start w:val="1"/>
+      <w:numFmt w:val="decimal"/>
+      <w:lvlText w:val="%2."/>
+      <w:lvlJc w:val="left"/>
+      <w:pPr>
+        <w:tabs>
+          <w:tab w:val="num" w:pos="1440"/>
+        </w:tabs>
+        <w:ind w:left="1440" w:hanging="360"/>
+      </w:pPr>
+    </w:lvl>
+    <w:lvl w:ilvl="2" w:tentative="1">
+      <w:start w:val="1"/>
+      <w:numFmt w:val="decimal"/>
+      <w:lvlText w:val="%3."/>
+      <w:lvlJc w:val="left"/>
+      <w:pPr>
+        <w:tabs>
+          <w:tab w:val="num" w:pos="2160"/>
+        </w:tabs>
+        <w:ind w:left="2160" w:hanging="360"/>
+      </w:pPr>
+    </w:lvl>
+    <w:lvl w:ilvl="3" w:tentative="1">
+      <w:start w:val="1"/>
+      <w:numFmt w:val="decimal"/>
+      <w:lvlText w:val="%4."/>
+      <w:lvlJc w:val="left"/>
+      <w:pPr>
+        <w:tabs>
+          <w:tab w:val="num" w:pos="2880"/>
+        </w:tabs>
+        <w:ind w:left="2880" w:hanging="360"/>
+      </w:pPr>
+    </w:lvl>
+    <w:lvl w:ilvl="4" w:tentative="1">
+      <w:start w:val="1"/>
+      <w:numFmt w:val="decimal"/>
+      <w:lvlText w:val="%5."/>
+      <w:lvlJc w:val="left"/>
+      <w:pPr>
+        <w:tabs>
+          <w:tab w:val="num" w:pos="3600"/>
+        </w:tabs>
+        <w:ind w:left="3600" w:hanging="360"/>
+      </w:pPr>
+    </w:lvl>
+    <w:lvl w:ilvl="5" w:tentative="1">
+      <w:start w:val="1"/>
+      <w:numFmt w:val="decimal"/>
+      <w:lvlText w:val="%6."/>
+      <w:lvlJc w:val="left"/>
+      <w:pPr>
+        <w:tabs>
+          <w:tab w:val="num" w:pos="4320"/>
+        </w:tabs>
+        <w:ind w:left="4320" w:hanging="360"/>
+      </w:pPr>
+    </w:lvl>
+    <w:lvl w:ilvl="6" w:tentative="1">
+      <w:start w:val="1"/>
+      <w:numFmt w:val="decimal"/>
+      <w:lvlText w:val="%7."/>
+      <w:lvlJc w:val="left"/>
+      <w:pPr>
+        <w:tabs>
+          <w:tab w:val="num" w:pos="5040"/>
+        </w:tabs>
+        <w:ind w:left="5040" w:hanging="360"/>
+      </w:pPr>
+    </w:lvl>
+    <w:lvl w:ilvl="7" w:tentative="1">
+      <w:start w:val="1"/>
+      <w:numFmt w:val="decimal"/>
+      <w:lvlText w:val="%8."/>
+      <w:lvlJc w:val="left"/>
+      <w:pPr>
+        <w:tabs>
+          <w:tab w:val="num" w:pos="5760"/>
+        </w:tabs>
+        <w:ind w:left="5760" w:hanging="360"/>
+      </w:pPr>
+    </w:lvl>
+    <w:lvl w:ilvl="8" w:tentative="1">
+      <w:start w:val="1"/>
+      <w:numFmt w:val="decimal"/>
+      <w:lvlText w:val="%9."/>
+      <w:lvlJc w:val="left"/>
+      <w:pPr>
+        <w:tabs>
+          <w:tab w:val="num" w:pos="6480"/>
+        </w:tabs>
+        <w:ind w:left="6480" w:hanging="360"/>
+      </w:pPr>
+    </w:lvl>
+  </w:abstractNum>
+  <w:abstractNum w:abstractNumId="2" w15:restartNumberingAfterBreak="0">
+    <w:nsid w:val="6DC15C2A"/>
+    <w:multiLevelType w:val="multilevel"/>
+    <w:tmpl w:val="17546A58"/>
+    <w:lvl w:ilvl="0">
+      <w:start w:val="1"/>
+      <w:numFmt w:val="decimal"/>
+      <w:lvlText w:val="%1."/>
+      <w:lvlJc w:val="left"/>
+      <w:pPr>
+        <w:tabs>
+          <w:tab w:val="num" w:pos="720"/>
+        </w:tabs>
+        <w:ind w:left="720" w:hanging="360"/>
+      </w:pPr>
+    </w:lvl>
+    <w:lvl w:ilvl="1" w:tentative="1">
+      <w:start w:val="1"/>
+      <w:numFmt w:val="decimal"/>
+      <w:lvlText w:val="%2."/>
+      <w:lvlJc w:val="left"/>
+      <w:pPr>
+        <w:tabs>
+          <w:tab w:val="num" w:pos="1440"/>
+        </w:tabs>
+        <w:ind w:left="1440" w:hanging="360"/>
+      </w:pPr>
+    </w:lvl>
+    <w:lvl w:ilvl="2" w:tentative="1">
+      <w:start w:val="1"/>
+      <w:numFmt w:val="decimal"/>
+      <w:lvlText w:val="%3."/>
+      <w:lvlJc w:val="left"/>
+      <w:pPr>
+        <w:tabs>
+          <w:tab w:val="num" w:pos="2160"/>
+        </w:tabs>
+        <w:ind w:left="2160" w:hanging="360"/>
+      </w:pPr>
+    </w:lvl>
+    <w:lvl w:ilvl="3" w:tentative="1">
+      <w:start w:val="1"/>
+      <w:numFmt w:val="decimal"/>
+      <w:lvlText w:val="%4."/>
+      <w:lvlJc w:val="left"/>
+      <w:pPr>
+        <w:tabs>
+          <w:tab w:val="num" w:pos="2880"/>
+        </w:tabs>
+        <w:ind w:left="2880" w:hanging="360"/>
+      </w:pPr>
+    </w:lvl>
+    <w:lvl w:ilvl="4" w:tentative="1">
+      <w:start w:val="1"/>
+      <w:numFmt w:val="decimal"/>
+      <w:lvlText w:val="%5."/>
+      <w:lvlJc w:val="left"/>
+      <w:pPr>
+        <w:tabs>
+          <w:tab w:val="num" w:pos="3600"/>
+        </w:tabs>
+        <w:ind w:left="3600" w:hanging="360"/>
+      </w:pPr>
+    </w:lvl>
+    <w:lvl w:ilvl="5" w:tentative="1">
+      <w:start w:val="1"/>
+      <w:numFmt w:val="decimal"/>
+      <w:lvlText w:val="%6."/>
+      <w:lvlJc w:val="left"/>
+      <w:pPr>
+        <w:tabs>
+          <w:tab w:val="num" w:pos="4320"/>
+        </w:tabs>
+        <w:ind w:left="4320" w:hanging="360"/>
+      </w:pPr>
+    </w:lvl>
+    <w:lvl w:ilvl="6" w:tentative="1">
+      <w:start w:val="1"/>
+      <w:numFmt w:val="decimal"/>
+      <w:lvlText w:val="%7."/>
+      <w:lvlJc w:val="left"/>
+      <w:pPr>
+        <w:tabs>
+          <w:tab w:val="num" w:pos="5040"/>
+        </w:tabs>
+        <w:ind w:left="5040" w:hanging="360"/>
+      </w:pPr>
+    </w:lvl>
+    <w:lvl w:ilvl="7" w:tentative="1">
+      <w:start w:val="1"/>
+      <w:numFmt w:val="decimal"/>
+      <w:lvlText w:val="%8."/>
+      <w:lvlJc w:val="left"/>
+      <w:pPr>
+        <w:tabs>
+          <w:tab w:val="num" w:pos="5760"/>
+        </w:tabs>
+        <w:ind w:left="5760" w:hanging="360"/>
+      </w:pPr>
+    </w:lvl>
+    <w:lvl w:ilvl="8" w:tentative="1">
+      <w:start w:val="1"/>
+      <w:numFmt w:val="decimal"/>
+      <w:lvlText w:val="%9."/>
+      <w:lvlJc w:val="left"/>
+      <w:pPr>
+        <w:tabs>
+          <w:tab w:val="num" w:pos="6480"/>
+        </w:tabs>
+        <w:ind w:left="6480" w:hanging="360"/>
+      </w:pPr>
+    </w:lvl>
+  </w:abstractNum>
+  <w:abstractNum w:abstractNumId="3" w15:restartNumberingAfterBreak="0">
+    <w:nsid w:val="706F2E0C"/>
+    <w:multiLevelType w:val="multilevel"/>
+    <w:tmpl w:val="6CE05C5C"/>
+    <w:lvl w:ilvl="0">
+      <w:start w:val="1"/>
+      <w:numFmt w:val="decimal"/>
+      <w:lvlText w:val="%1."/>
+      <w:lvlJc w:val="left"/>
+      <w:pPr>
+        <w:tabs>
+          <w:tab w:val="num" w:pos="720"/>
+        </w:tabs>
+        <w:ind w:left="720" w:hanging="360"/>
+      </w:pPr>
+    </w:lvl>
+    <w:lvl w:ilvl="1" w:tentative="1">
+      <w:start w:val="1"/>
+      <w:numFmt w:val="decimal"/>
+      <w:lvlText w:val="%2."/>
+      <w:lvlJc w:val="left"/>
+      <w:pPr>
+        <w:tabs>
+          <w:tab w:val="num" w:pos="1440"/>
+        </w:tabs>
+        <w:ind w:left="1440" w:hanging="360"/>
+      </w:pPr>
+    </w:lvl>
+    <w:lvl w:ilvl="2" w:tentative="1">
+      <w:start w:val="1"/>
+      <w:numFmt w:val="decimal"/>
+      <w:lvlText w:val="%3."/>
+      <w:lvlJc w:val="left"/>
+      <w:pPr>
+        <w:tabs>
+          <w:tab w:val="num" w:pos="2160"/>
+        </w:tabs>
+        <w:ind w:left="2160" w:hanging="360"/>
+      </w:pPr>
+    </w:lvl>
+    <w:lvl w:ilvl="3" w:tentative="1">
+      <w:start w:val="1"/>
+      <w:numFmt w:val="decimal"/>
+      <w:lvlText w:val="%4."/>
+      <w:lvlJc w:val="left"/>
+      <w:pPr>
+        <w:tabs>
+          <w:tab w:val="num" w:pos="2880"/>
+        </w:tabs>
+        <w:ind w:left="2880" w:hanging="360"/>
+      </w:pPr>
+    </w:lvl>
+    <w:lvl w:ilvl="4" w:tentative="1">
+      <w:start w:val="1"/>
+      <w:numFmt w:val="decimal"/>
+      <w:lvlText w:val="%5."/>
+      <w:lvlJc w:val="left"/>
+      <w:pPr>
+        <w:tabs>
+          <w:tab w:val="num" w:pos="3600"/>
+        </w:tabs>
+        <w:ind w:left="3600" w:hanging="360"/>
+      </w:pPr>
+    </w:lvl>
+    <w:lvl w:ilvl="5" w:tentative="1">
+      <w:start w:val="1"/>
+      <w:numFmt w:val="decimal"/>
+      <w:lvlText w:val="%6."/>
+      <w:lvlJc w:val="left"/>
+      <w:pPr>
+        <w:tabs>
+          <w:tab w:val="num" w:pos="4320"/>
+        </w:tabs>
+        <w:ind w:left="4320" w:hanging="360"/>
+      </w:pPr>
+    </w:lvl>
+    <w:lvl w:ilvl="6" w:tentative="1">
+      <w:start w:val="1"/>
+      <w:numFmt w:val="decimal"/>
+      <w:lvlText w:val="%7."/>
+      <w:lvlJc w:val="left"/>
+      <w:pPr>
+        <w:tabs>
+          <w:tab w:val="num" w:pos="5040"/>
+        </w:tabs>
+        <w:ind w:left="5040" w:hanging="360"/>
+      </w:pPr>
+    </w:lvl>
+    <w:lvl w:ilvl="7" w:tentative="1">
+      <w:start w:val="1"/>
+      <w:numFmt w:val="decimal"/>
+      <w:lvlText w:val="%8."/>
+      <w:lvlJc w:val="left"/>
+      <w:pPr>
+        <w:tabs>
+          <w:tab w:val="num" w:pos="5760"/>
+        </w:tabs>
+        <w:ind w:left="5760" w:hanging="360"/>
+      </w:pPr>
+    </w:lvl>
+    <w:lvl w:ilvl="8" w:tentative="1">
+      <w:start w:val="1"/>
+      <w:numFmt w:val="decimal"/>
+      <w:lvlText w:val="%9."/>
+      <w:lvlJc w:val="left"/>
+      <w:pPr>
+        <w:tabs>
+          <w:tab w:val="num" w:pos="6480"/>
+        </w:tabs>
+        <w:ind w:left="6480" w:hanging="360"/>
+      </w:pPr>
+    </w:lvl>
+  </w:abstractNum>
+  <w:num w:numId="1" w16cid:durableId="182865977">
+    <w:abstractNumId w:val="1"/>
+  </w:num>
+  <w:num w:numId="2" w16cid:durableId="1488470858">
+    <w:abstractNumId w:val="3"/>
+  </w:num>
+  <w:num w:numId="3" w16cid:durableId="450780862">
+    <w:abstractNumId w:val="0"/>
+  </w:num>
+  <w:num w:numId="4" w16cid:durableId="650334477">
+    <w:abstractNumId w:val="2"/>
+  </w:num>
+</w:numbering>
 </file>
 
 <file path=word/styles.xml><?xml version="1.0" encoding="utf-8"?>
@@ -847,7 +1789,6 @@
   <w:style w:type="character" w:default="1" w:styleId="Fuentedeprrafopredeter">
     <w:name w:val="Default Paragraph Font"/>
     <w:uiPriority w:val="1"/>
-    <w:semiHidden/>
     <w:unhideWhenUsed/>
   </w:style>
   <w:style w:type="table" w:default="1" w:styleId="Tablanormal">

</xml_diff>

<commit_message>
Update EL POLLO document
</commit_message>
<xml_diff>
--- a/EL POLLO.docx
+++ b/EL POLLO.docx
@@ -42,11 +42,19 @@
       <w:r>
         <w:t xml:space="preserve"> </w:t>
       </w:r>
+      <w:proofErr w:type="gramStart"/>
       <w:r>
         <w:rPr>
           <w:highlight w:val="yellow"/>
         </w:rPr>
-        <w:t>( BEBEDEROS Y COMEDEROS)</w:t>
+        <w:t>( BEBEDEROS</w:t>
+      </w:r>
+      <w:proofErr w:type="gramEnd"/>
+      <w:r>
+        <w:rPr>
+          <w:highlight w:val="yellow"/>
+        </w:rPr>
+        <w:t xml:space="preserve"> Y COMEDEROS)</w:t>
       </w:r>
     </w:p>
     <w:p>
@@ -96,7 +104,23 @@
         </w:numPr>
       </w:pPr>
       <w:r>
-        <w:t>Amontonar pollinaza 8 dias y registrar temperatura interna</w:t>
+        <w:t xml:space="preserve">Amontonar </w:t>
+      </w:r>
+      <w:proofErr w:type="spellStart"/>
+      <w:r>
+        <w:t>pollinaza</w:t>
+      </w:r>
+      <w:proofErr w:type="spellEnd"/>
+      <w:r>
+        <w:t xml:space="preserve"> 8 </w:t>
+      </w:r>
+      <w:proofErr w:type="spellStart"/>
+      <w:r>
+        <w:t>dias</w:t>
+      </w:r>
+      <w:proofErr w:type="spellEnd"/>
+      <w:r>
+        <w:t xml:space="preserve"> y registrar temperatura interna</w:t>
       </w:r>
     </w:p>
     <w:p>
@@ -107,10 +131,19 @@
         </w:numPr>
       </w:pPr>
       <w:r>
-        <w:t>Retiro de Pollinaza Reusada en Exceso</w:t>
-      </w:r>
-    </w:p>
-    <w:p>
+        <w:t xml:space="preserve">Retiro de </w:t>
+      </w:r>
+      <w:proofErr w:type="spellStart"/>
+      <w:r>
+        <w:t>Pollinaza</w:t>
+      </w:r>
+      <w:proofErr w:type="spellEnd"/>
+      <w:r>
+        <w:t xml:space="preserve"> Reusada en Exceso</w:t>
+      </w:r>
+    </w:p>
+    <w:p>
+      <w:proofErr w:type="spellStart"/>
       <w:r>
         <w:rPr>
           <w:b/>
@@ -118,6 +151,7 @@
         </w:rPr>
         <w:t>Desinfeccion</w:t>
       </w:r>
+      <w:proofErr w:type="spellEnd"/>
       <w:r>
         <w:rPr>
           <w:b/>
@@ -156,8 +190,13 @@
         </w:numPr>
       </w:pPr>
       <w:r>
-        <w:t>Barrer / Lavado Galpon</w:t>
-      </w:r>
+        <w:t xml:space="preserve">Barrer / Lavado </w:t>
+      </w:r>
+      <w:proofErr w:type="spellStart"/>
+      <w:r>
+        <w:t>Galpon</w:t>
+      </w:r>
+      <w:proofErr w:type="spellEnd"/>
     </w:p>
     <w:p>
       <w:pPr>
@@ -189,8 +228,13 @@
         </w:numPr>
       </w:pPr>
       <w:r>
-        <w:t>Lavar tanques de agua y purgar lineas</w:t>
-      </w:r>
+        <w:t xml:space="preserve">Lavar tanques de agua y purgar </w:t>
+      </w:r>
+      <w:proofErr w:type="spellStart"/>
+      <w:r>
+        <w:t>lineas</w:t>
+      </w:r>
+      <w:proofErr w:type="spellEnd"/>
     </w:p>
     <w:p>
       <w:pPr>
@@ -199,9 +243,11 @@
           <w:numId w:val="2"/>
         </w:numPr>
       </w:pPr>
+      <w:proofErr w:type="spellStart"/>
       <w:r>
         <w:t>Calear</w:t>
       </w:r>
+      <w:proofErr w:type="spellEnd"/>
     </w:p>
     <w:p>
       <w:pPr>
@@ -264,8 +310,13 @@
         </w:numPr>
       </w:pPr>
       <w:r>
-        <w:t>Meter Bebederos de Volteo y Comederos Babies</w:t>
-      </w:r>
+        <w:t xml:space="preserve">Meter Bebederos de Volteo y Comederos </w:t>
+      </w:r>
+      <w:proofErr w:type="spellStart"/>
+      <w:r>
+        <w:t>Babies</w:t>
+      </w:r>
+      <w:proofErr w:type="spellEnd"/>
     </w:p>
     <w:p>
       <w:pPr>
@@ -285,11 +336,6 @@
       </w:r>
     </w:p>
     <w:p>
-      <w:pPr>
-        <w:ind w:left="720"/>
-      </w:pPr>
-    </w:p>
-    <w:p>
       <w:r>
         <w:rPr>
           <w:b/>
@@ -326,8 +372,13 @@
         </w:numPr>
       </w:pPr>
       <w:r>
-        <w:t>Purgar Lineas</w:t>
-      </w:r>
+        <w:t xml:space="preserve">Purgar </w:t>
+      </w:r>
+      <w:proofErr w:type="spellStart"/>
+      <w:r>
+        <w:t>Lineas</w:t>
+      </w:r>
+      <w:proofErr w:type="spellEnd"/>
     </w:p>
     <w:p>
       <w:pPr>
@@ -336,8 +387,13 @@
           <w:numId w:val="4"/>
         </w:numPr>
       </w:pPr>
-      <w:r>
-        <w:t>Neutrar el Agua de Bebida</w:t>
+      <w:proofErr w:type="spellStart"/>
+      <w:r>
+        <w:t>Neutrar</w:t>
+      </w:r>
+      <w:proofErr w:type="spellEnd"/>
+      <w:r>
+        <w:t xml:space="preserve"> el Agua de Bebida</w:t>
       </w:r>
     </w:p>
     <w:p>
@@ -359,22 +415,22 @@
         </w:numPr>
       </w:pPr>
       <w:r>
+        <w:t>Llegada del Pollito</w:t>
+      </w:r>
+    </w:p>
+    <w:p>
+      <w:pPr>
+        <w:rPr>
+          <w:b/>
+          <w:bCs/>
+        </w:rPr>
+      </w:pPr>
+      <w:r>
+        <w:rPr>
+          <w:b/>
+          <w:bCs/>
+        </w:rPr>
         <w:lastRenderedPageBreak/>
-        <w:t>Llegada del Pollito</w:t>
-      </w:r>
-    </w:p>
-    <w:p>
-      <w:pPr>
-        <w:rPr>
-          <w:b/>
-          <w:bCs/>
-        </w:rPr>
-      </w:pPr>
-      <w:r>
-        <w:rPr>
-          <w:b/>
-          <w:bCs/>
-        </w:rPr>
         <w:t>ACTIVIDADES DEL LOTE</w:t>
       </w:r>
     </w:p>
@@ -580,7 +636,15 @@
         <w:t>MEDIR EL</w:t>
       </w:r>
       <w:r>
-        <w:t xml:space="preserve"> CLORO Y PH  EN LAS LINEAS, TANQUES </w:t>
+        <w:t xml:space="preserve"> CLORO Y </w:t>
+      </w:r>
+      <w:proofErr w:type="gramStart"/>
+      <w:r>
+        <w:t>PH  EN</w:t>
+      </w:r>
+      <w:proofErr w:type="gramEnd"/>
+      <w:r>
+        <w:t xml:space="preserve"> LAS LINEAS, TANQUES </w:t>
       </w:r>
     </w:p>
     <w:p>
@@ -633,7 +697,15 @@
     </w:p>
     <w:p>
       <w:r>
-        <w:t>*NOVABRONCOL O VIRCONX ( CASOS ESPECIALES)</w:t>
+        <w:t xml:space="preserve">*NOVABRONCOL O VIRCONX </w:t>
+      </w:r>
+      <w:proofErr w:type="gramStart"/>
+      <w:r>
+        <w:t>( CASOS</w:t>
+      </w:r>
+      <w:proofErr w:type="gramEnd"/>
+      <w:r>
+        <w:t xml:space="preserve"> ESPECIALES)</w:t>
       </w:r>
     </w:p>
     <w:p/>
@@ -664,7 +736,6 @@
           <w:sz w:val="24"/>
           <w:szCs w:val="24"/>
         </w:rPr>
-        <w:lastRenderedPageBreak/>
         <w:t>RUTINA</w:t>
       </w:r>
       <w:r>
@@ -679,6 +750,7 @@
     </w:p>
     <w:p>
       <w:r>
+        <w:lastRenderedPageBreak/>
         <w:br/>
       </w:r>
       <w:r>
@@ -704,6 +776,11 @@
     <w:p>
       <w:r>
         <w:t>CIPERMETRINA (DIARIO) (PARA LA MOSCA) ALREDEDOR DEL GALPON.  5PM</w:t>
+      </w:r>
+    </w:p>
+    <w:p>
+      <w:r>
+        <w:t>LIMPIAR MALLAS Y TELARAÑAS</w:t>
       </w:r>
     </w:p>
     <w:p/>

</xml_diff>